<commit_message>
introduced recommendation of best battery
</commit_message>
<xml_diff>
--- a/doc/Altro/Optimization-Reccomandation.docx
+++ b/doc/Altro/Optimization-Reccomandation.docx
@@ -773,8 +773,8 @@
       </w:tblPr>
       <w:tblGrid>
         <w:gridCol w:w="1696"/>
-        <w:gridCol w:w="3686"/>
-        <w:gridCol w:w="3118"/>
+        <w:gridCol w:w="3828"/>
+        <w:gridCol w:w="2976"/>
       </w:tblGrid>
       <w:tr>
         <w:tc>
@@ -812,7 +812,7 @@
         </w:tc>
         <w:tc>
           <w:tcPr>
-            <w:tcW w:w="3686" w:type="dxa"/>
+            <w:tcW w:w="3828" w:type="dxa"/>
             <w:tcBorders>
               <w:top w:val="single" w:sz="4" w:space="0" w:color="000000"/>
               <w:left w:val="single" w:sz="4" w:space="0" w:color="000000"/>
@@ -846,7 +846,7 @@
         </w:tc>
         <w:tc>
           <w:tcPr>
-            <w:tcW w:w="3118" w:type="dxa"/>
+            <w:tcW w:w="2976" w:type="dxa"/>
             <w:tcBorders>
               <w:top w:val="single" w:sz="4" w:space="0" w:color="000000"/>
               <w:left w:val="single" w:sz="4" w:space="0" w:color="000000"/>
@@ -945,7 +945,7 @@
         </w:tc>
         <w:tc>
           <w:tcPr>
-            <w:tcW w:w="3686" w:type="dxa"/>
+            <w:tcW w:w="3828" w:type="dxa"/>
             <w:tcBorders>
               <w:top w:val="single" w:sz="4" w:space="0" w:color="000000"/>
               <w:left w:val="single" w:sz="4" w:space="0" w:color="000000"/>
@@ -1411,16 +1411,38 @@
                 <w:lang w:val="en-US"/>
               </w:rPr>
             </w:pPr>
+            <w:r>
+              <w:rPr>
+                <w:rFonts w:ascii="Courier New" w:eastAsia="Times New Roman" w:hAnsi="Courier New" w:cs="Courier New"/>
+                <w:color w:val="000000"/>
+                <w:sz w:val="16"/>
+                <w:szCs w:val="16"/>
+                <w:lang w:val="en-US"/>
+              </w:rPr>
+              <w:t>"</w:t>
+            </w:r>
             <w:proofErr w:type="spellStart"/>
-            <w:r>
-              <w:rPr>
-                <w:rFonts w:ascii="Courier New" w:eastAsia="Times New Roman" w:hAnsi="Courier New" w:cs="Courier New"/>
-                <w:color w:val="000000"/>
-                <w:sz w:val="16"/>
-                <w:szCs w:val="16"/>
-                <w:lang w:val="en-US"/>
-              </w:rPr>
-              <w:t>time_execution_limit_secs</w:t>
+            <w:proofErr w:type="gramStart"/>
+            <w:r>
+              <w:rPr>
+                <w:rFonts w:ascii="Courier New" w:eastAsia="Times New Roman" w:hAnsi="Courier New" w:cs="Courier New"/>
+                <w:color w:val="000000"/>
+                <w:sz w:val="16"/>
+                <w:szCs w:val="16"/>
+                <w:lang w:val="en-US"/>
+              </w:rPr>
+              <w:t>time</w:t>
+            </w:r>
+            <w:proofErr w:type="gramEnd"/>
+            <w:r>
+              <w:rPr>
+                <w:rFonts w:ascii="Courier New" w:eastAsia="Times New Roman" w:hAnsi="Courier New" w:cs="Courier New"/>
+                <w:color w:val="000000"/>
+                <w:sz w:val="16"/>
+                <w:szCs w:val="16"/>
+                <w:lang w:val="en-US"/>
+              </w:rPr>
+              <w:t>_execution_limit_secs</w:t>
             </w:r>
             <w:proofErr w:type="spellEnd"/>
             <w:r>
@@ -1433,6 +1455,80 @@
               </w:rPr>
               <w:t>": integer</w:t>
             </w:r>
+            <w:r>
+              <w:rPr>
+                <w:rFonts w:ascii="Courier New" w:eastAsia="Times New Roman" w:hAnsi="Courier New" w:cs="Courier New"/>
+                <w:color w:val="000000"/>
+                <w:sz w:val="16"/>
+                <w:szCs w:val="16"/>
+                <w:lang w:val="en-US"/>
+              </w:rPr>
+              <w:t>,</w:t>
+            </w:r>
+          </w:p>
+          <w:p>
+            <w:pPr>
+              <w:spacing w:after="0" w:line="240" w:lineRule="auto"/>
+              <w:rPr>
+                <w:rFonts w:ascii="Courier New" w:eastAsia="Times New Roman" w:hAnsi="Courier New" w:cs="Courier New"/>
+                <w:color w:val="000000"/>
+                <w:sz w:val="16"/>
+                <w:szCs w:val="16"/>
+                <w:lang w:val="en-US"/>
+              </w:rPr>
+            </w:pPr>
+            <w:r>
+              <w:rPr>
+                <w:rFonts w:ascii="Courier New" w:eastAsia="Times New Roman" w:hAnsi="Courier New" w:cs="Courier New"/>
+                <w:color w:val="000000"/>
+                <w:sz w:val="16"/>
+                <w:szCs w:val="16"/>
+                <w:lang w:val="en-US"/>
+              </w:rPr>
+              <w:t>"</w:t>
+            </w:r>
+            <w:r>
+              <w:rPr>
+                <w:rFonts w:ascii="Courier New" w:eastAsia="Times New Roman" w:hAnsi="Courier New" w:cs="Courier New"/>
+                <w:color w:val="000000"/>
+                <w:sz w:val="16"/>
+                <w:szCs w:val="16"/>
+                <w:lang w:val="en-US"/>
+              </w:rPr>
+              <w:t>schedule</w:t>
+            </w:r>
+            <w:r>
+              <w:rPr>
+                <w:rFonts w:ascii="Courier New" w:eastAsia="Times New Roman" w:hAnsi="Courier New" w:cs="Courier New"/>
+                <w:color w:val="000000"/>
+                <w:sz w:val="16"/>
+                <w:szCs w:val="16"/>
+                <w:lang w:val="en-US"/>
+              </w:rPr>
+              <w:t>"</w:t>
+            </w:r>
+            <w:r>
+              <w:rPr>
+                <w:rFonts w:ascii="Courier New" w:eastAsia="Times New Roman" w:hAnsi="Courier New" w:cs="Courier New"/>
+                <w:color w:val="000000"/>
+                <w:sz w:val="16"/>
+                <w:szCs w:val="16"/>
+                <w:lang w:val="en-US"/>
+              </w:rPr>
+              <w:t xml:space="preserve">: </w:t>
+            </w:r>
+            <w:proofErr w:type="spellStart"/>
+            <w:r>
+              <w:rPr>
+                <w:rFonts w:ascii="Courier New" w:eastAsia="Times New Roman" w:hAnsi="Courier New" w:cs="Courier New"/>
+                <w:color w:val="000000"/>
+                <w:sz w:val="16"/>
+                <w:szCs w:val="16"/>
+                <w:lang w:val="en-US"/>
+              </w:rPr>
+              <w:t>boolean</w:t>
+            </w:r>
+            <w:proofErr w:type="spellEnd"/>
           </w:p>
           <w:p>
             <w:pPr>
@@ -1458,7 +1554,7 @@
         </w:tc>
         <w:tc>
           <w:tcPr>
-            <w:tcW w:w="3118" w:type="dxa"/>
+            <w:tcW w:w="2976" w:type="dxa"/>
             <w:tcBorders>
               <w:top w:val="single" w:sz="4" w:space="0" w:color="000000"/>
               <w:left w:val="single" w:sz="4" w:space="0" w:color="000000"/>
@@ -3062,25 +3158,7 @@
           <w:lang w:eastAsia="it-IT"/>
           <w14:ligatures w14:val="none"/>
         </w:rPr>
-        <w:t xml:space="preserve">è un array di valori di </w:t>
-      </w:r>
-      <w:r>
-        <w:rPr>
-          <w:rFonts w:ascii="Times New Roman" w:eastAsia="Times New Roman" w:hAnsi="Times New Roman" w:cs="Times New Roman"/>
-          <w:kern w:val="0"/>
-          <w:lang w:eastAsia="it-IT"/>
-          <w14:ligatures w14:val="none"/>
-        </w:rPr>
-        <w:t>consumo</w:t>
-      </w:r>
-      <w:r>
-        <w:rPr>
-          <w:rFonts w:ascii="Times New Roman" w:eastAsia="Times New Roman" w:hAnsi="Times New Roman" w:cs="Times New Roman"/>
-          <w:kern w:val="0"/>
-          <w:lang w:eastAsia="it-IT"/>
-          <w14:ligatures w14:val="none"/>
-        </w:rPr>
-        <w:t xml:space="preserve"> espressi in kWh. In particolare, ogni elemento dell’array ha un “time” che indica l’orario di rilevazione del</w:t>
+        <w:t>è un array di valori di consumo espressi in kWh. In particolare, ogni elemento dell’array ha un “time” che indica l’orario di rilevazione del</w:t>
       </w:r>
       <w:r>
         <w:rPr>
@@ -3188,6 +3266,106 @@
     </w:p>
     <w:p>
       <w:pPr>
+        <w:numPr>
+          <w:ilvl w:val="0"/>
+          <w:numId w:val="3"/>
+        </w:numPr>
+        <w:spacing w:before="100" w:beforeAutospacing="1" w:after="100" w:afterAutospacing="1" w:line="240" w:lineRule="auto"/>
+        <w:jc w:val="both"/>
+        <w:rPr>
+          <w:rFonts w:ascii="Times New Roman" w:eastAsia="Times New Roman" w:hAnsi="Times New Roman" w:cs="Times New Roman"/>
+          <w:i/>
+          <w:iCs/>
+          <w:kern w:val="0"/>
+          <w:lang w:eastAsia="it-IT"/>
+          <w14:ligatures w14:val="none"/>
+        </w:rPr>
+      </w:pPr>
+      <w:r>
+        <w:rPr>
+          <w:rFonts w:ascii="Times New Roman" w:eastAsia="Times New Roman" w:hAnsi="Times New Roman" w:cs="Times New Roman"/>
+          <w:i/>
+          <w:iCs/>
+          <w:kern w:val="0"/>
+          <w:lang w:eastAsia="it-IT"/>
+          <w14:ligatures w14:val="none"/>
+        </w:rPr>
+        <w:t>schedule</w:t>
+      </w:r>
+      <w:r>
+        <w:rPr>
+          <w:rFonts w:ascii="Times New Roman" w:eastAsia="Times New Roman" w:hAnsi="Times New Roman" w:cs="Times New Roman"/>
+          <w:kern w:val="0"/>
+          <w:lang w:eastAsia="it-IT"/>
+          <w14:ligatures w14:val="none"/>
+        </w:rPr>
+        <w:t>:</w:t>
+      </w:r>
+      <w:r>
+        <w:rPr>
+          <w:rFonts w:ascii="Times New Roman" w:eastAsia="Times New Roman" w:hAnsi="Times New Roman" w:cs="Times New Roman"/>
+          <w:kern w:val="0"/>
+          <w:lang w:eastAsia="it-IT"/>
+          <w14:ligatures w14:val="none"/>
+        </w:rPr>
+        <w:t xml:space="preserve"> si tratta di un booleano che indica se l’esecuzione deve essere eseguita in background. In tal caso viene restituito un </w:t>
+      </w:r>
+      <w:r>
+        <w:rPr>
+          <w:rFonts w:ascii="Times New Roman" w:eastAsia="Times New Roman" w:hAnsi="Times New Roman" w:cs="Times New Roman"/>
+          <w:i/>
+          <w:iCs/>
+          <w:kern w:val="0"/>
+          <w:lang w:eastAsia="it-IT"/>
+          <w14:ligatures w14:val="none"/>
+        </w:rPr>
+        <w:t>id</w:t>
+      </w:r>
+      <w:r>
+        <w:rPr>
+          <w:rFonts w:ascii="Times New Roman" w:eastAsia="Times New Roman" w:hAnsi="Times New Roman" w:cs="Times New Roman"/>
+          <w:kern w:val="0"/>
+          <w:lang w:eastAsia="it-IT"/>
+          <w14:ligatures w14:val="none"/>
+        </w:rPr>
+        <w:t xml:space="preserve"> di esecuzione che può essere utilizzato dal servizio denominato </w:t>
+      </w:r>
+      <w:proofErr w:type="spellStart"/>
+      <w:r>
+        <w:rPr>
+          <w:rFonts w:ascii="Times New Roman" w:eastAsia="Times New Roman" w:hAnsi="Times New Roman" w:cs="Times New Roman"/>
+          <w:i/>
+          <w:iCs/>
+          <w:kern w:val="0"/>
+          <w:lang w:eastAsia="it-IT"/>
+          <w14:ligatures w14:val="none"/>
+        </w:rPr>
+        <w:t>get_</w:t>
+      </w:r>
+      <w:r>
+        <w:rPr>
+          <w:rFonts w:ascii="Times New Roman" w:eastAsia="Times New Roman" w:hAnsi="Times New Roman" w:cs="Times New Roman"/>
+          <w:i/>
+          <w:iCs/>
+          <w:kern w:val="0"/>
+          <w:lang w:eastAsia="it-IT"/>
+          <w14:ligatures w14:val="none"/>
+        </w:rPr>
+        <w:t>best_grid_transfer</w:t>
+      </w:r>
+      <w:proofErr w:type="spellEnd"/>
+      <w:r>
+        <w:rPr>
+          <w:rFonts w:ascii="Times New Roman" w:eastAsia="Times New Roman" w:hAnsi="Times New Roman" w:cs="Times New Roman"/>
+          <w:kern w:val="0"/>
+          <w:lang w:eastAsia="it-IT"/>
+          <w14:ligatures w14:val="none"/>
+        </w:rPr>
+        <w:t xml:space="preserve"> per ottenere il risultato una volta eseguito.</w:t>
+      </w:r>
+    </w:p>
+    <w:p>
+      <w:pPr>
         <w:pStyle w:val="NormaleWeb"/>
         <w:jc w:val="both"/>
       </w:pPr>
@@ -3276,25 +3454,7 @@
           <w:lang w:eastAsia="it-IT"/>
           <w14:ligatures w14:val="none"/>
         </w:rPr>
-        <w:t xml:space="preserve"> </w:t>
-      </w:r>
-      <w:r>
-        <w:rPr>
-          <w:rFonts w:ascii="Times New Roman" w:eastAsia="Times New Roman" w:hAnsi="Times New Roman" w:cs="Times New Roman"/>
-          <w:kern w:val="0"/>
-          <w:lang w:eastAsia="it-IT"/>
-          <w14:ligatures w14:val="none"/>
-        </w:rPr>
-        <w:t xml:space="preserve">preso </w:t>
-      </w:r>
-      <w:r>
-        <w:rPr>
-          <w:rFonts w:ascii="Times New Roman" w:eastAsia="Times New Roman" w:hAnsi="Times New Roman" w:cs="Times New Roman"/>
-          <w:kern w:val="0"/>
-          <w:lang w:eastAsia="it-IT"/>
-          <w14:ligatures w14:val="none"/>
-        </w:rPr>
-        <w:t>in considerazione nel calcolo della soluzione.</w:t>
+        <w:t xml:space="preserve"> preso in considerazione nel calcolo della soluzione.</w:t>
       </w:r>
     </w:p>
     <w:p>
@@ -3332,16 +3492,7 @@
           <w:lang w:eastAsia="it-IT"/>
           <w14:ligatures w14:val="none"/>
         </w:rPr>
-        <w:t xml:space="preserve">: </w:t>
-      </w:r>
-      <w:r>
-        <w:rPr>
-          <w:rFonts w:ascii="Times New Roman" w:eastAsia="Times New Roman" w:hAnsi="Times New Roman" w:cs="Times New Roman"/>
-          <w:kern w:val="0"/>
-          <w:lang w:eastAsia="it-IT"/>
-          <w14:ligatures w14:val="none"/>
-        </w:rPr>
-        <w:t>è un array di valori</w:t>
+        <w:t>: è un array di valori</w:t>
       </w:r>
       <w:r>
         <w:rPr>
@@ -3471,16 +3622,7 @@
           <w:lang w:eastAsia="it-IT"/>
           <w14:ligatures w14:val="none"/>
         </w:rPr>
-        <w:t xml:space="preserve"> che indicano la quantità di energia da</w:t>
-      </w:r>
-      <w:r>
-        <w:rPr>
-          <w:rFonts w:ascii="Times New Roman" w:eastAsia="Times New Roman" w:hAnsi="Times New Roman" w:cs="Times New Roman"/>
-          <w:kern w:val="0"/>
-          <w:lang w:eastAsia="it-IT"/>
-          <w14:ligatures w14:val="none"/>
-        </w:rPr>
-        <w:t xml:space="preserve"> accumulare nella batteria in un certo orario.</w:t>
+        <w:t xml:space="preserve"> che indicano la quantità di energia da accumulare nella batteria in un certo orario.</w:t>
       </w:r>
       <w:r>
         <w:rPr>
@@ -3518,24 +3660,6 @@
           <w:lang w:eastAsia="it-IT"/>
           <w14:ligatures w14:val="none"/>
         </w:rPr>
-        <w:t xml:space="preserve"> indica quanta energia </w:t>
-      </w:r>
-      <w:r>
-        <w:rPr>
-          <w:rFonts w:ascii="Times New Roman" w:eastAsia="Times New Roman" w:hAnsi="Times New Roman" w:cs="Times New Roman"/>
-          <w:kern w:val="0"/>
-          <w:lang w:eastAsia="it-IT"/>
-          <w14:ligatures w14:val="none"/>
-        </w:rPr>
-        <w:t>immagazzinare</w:t>
-      </w:r>
-      <w:r>
-        <w:rPr>
-          <w:rFonts w:ascii="Times New Roman" w:eastAsia="Times New Roman" w:hAnsi="Times New Roman" w:cs="Times New Roman"/>
-          <w:kern w:val="0"/>
-          <w:lang w:eastAsia="it-IT"/>
-          <w14:ligatures w14:val="none"/>
-        </w:rPr>
         <w:t xml:space="preserve"> </w:t>
       </w:r>
       <w:r>
@@ -3545,16 +3669,8 @@
           <w:lang w:eastAsia="it-IT"/>
           <w14:ligatures w14:val="none"/>
         </w:rPr>
-        <w:t>ne</w:t>
-      </w:r>
-      <w:r>
-        <w:rPr>
-          <w:rFonts w:ascii="Times New Roman" w:eastAsia="Times New Roman" w:hAnsi="Times New Roman" w:cs="Times New Roman"/>
-          <w:kern w:val="0"/>
-          <w:lang w:eastAsia="it-IT"/>
-          <w14:ligatures w14:val="none"/>
-        </w:rPr>
-        <w:t>lla batteria, mentre “time” indica l’orario in cui si</w:t>
+        <w:lastRenderedPageBreak/>
+        <w:t>indica quanta energia immagazzinare nella batteria, mentre “time” indica l’orario in cui si</w:t>
       </w:r>
       <w:r>
         <w:rPr>
@@ -3572,25 +3688,7 @@
           <w:lang w:eastAsia="it-IT"/>
           <w14:ligatures w14:val="none"/>
         </w:rPr>
-        <w:t xml:space="preserve">raccomanda di </w:t>
-      </w:r>
-      <w:r>
-        <w:rPr>
-          <w:rFonts w:ascii="Times New Roman" w:eastAsia="Times New Roman" w:hAnsi="Times New Roman" w:cs="Times New Roman"/>
-          <w:kern w:val="0"/>
-          <w:lang w:eastAsia="it-IT"/>
-          <w14:ligatures w14:val="none"/>
-        </w:rPr>
-        <w:t>caricare</w:t>
-      </w:r>
-      <w:r>
-        <w:rPr>
-          <w:rFonts w:ascii="Times New Roman" w:eastAsia="Times New Roman" w:hAnsi="Times New Roman" w:cs="Times New Roman"/>
-          <w:kern w:val="0"/>
-          <w:lang w:eastAsia="it-IT"/>
-          <w14:ligatures w14:val="none"/>
-        </w:rPr>
-        <w:t xml:space="preserve"> tale quantità.</w:t>
+        <w:t>raccomanda di caricare tale quantità.</w:t>
       </w:r>
     </w:p>
     <w:p>
@@ -3617,7 +3715,6 @@
           <w:lang w:eastAsia="it-IT"/>
           <w14:ligatures w14:val="none"/>
         </w:rPr>
-        <w:lastRenderedPageBreak/>
         <w:t>production</w:t>
       </w:r>
       <w:r>
@@ -4448,633 +4545,6 @@
                 <w:szCs w:val="16"/>
                 <w:lang w:val="en-US"/>
               </w:rPr>
-              <w:t>"discharge": [</w:t>
-            </w:r>
-          </w:p>
-          <w:p>
-            <w:pPr>
-              <w:spacing w:after="0" w:line="240" w:lineRule="auto"/>
-              <w:rPr>
-                <w:rFonts w:ascii="Courier New" w:eastAsia="Times New Roman" w:hAnsi="Courier New" w:cs="Courier New"/>
-                <w:color w:val="000000"/>
-                <w:sz w:val="16"/>
-                <w:szCs w:val="16"/>
-                <w:lang w:val="en-US"/>
-              </w:rPr>
-            </w:pPr>
-            <w:r>
-              <w:rPr>
-                <w:rFonts w:ascii="Courier New" w:eastAsia="Times New Roman" w:hAnsi="Courier New" w:cs="Courier New"/>
-                <w:color w:val="000000"/>
-                <w:sz w:val="16"/>
-                <w:szCs w:val="16"/>
-                <w:lang w:val="en-US"/>
-              </w:rPr>
-              <w:t xml:space="preserve">  {</w:t>
-            </w:r>
-          </w:p>
-          <w:p>
-            <w:pPr>
-              <w:spacing w:after="0" w:line="240" w:lineRule="auto"/>
-              <w:rPr>
-                <w:rFonts w:ascii="Courier New" w:eastAsia="Times New Roman" w:hAnsi="Courier New" w:cs="Courier New"/>
-                <w:color w:val="000000"/>
-                <w:sz w:val="16"/>
-                <w:szCs w:val="16"/>
-                <w:lang w:val="en-US"/>
-              </w:rPr>
-            </w:pPr>
-            <w:r>
-              <w:rPr>
-                <w:rFonts w:ascii="Courier New" w:eastAsia="Times New Roman" w:hAnsi="Courier New" w:cs="Courier New"/>
-                <w:color w:val="000000"/>
-                <w:sz w:val="16"/>
-                <w:szCs w:val="16"/>
-                <w:lang w:val="en-US"/>
-              </w:rPr>
-              <w:t xml:space="preserve">   "time": string,</w:t>
-            </w:r>
-          </w:p>
-          <w:p>
-            <w:pPr>
-              <w:spacing w:after="0" w:line="240" w:lineRule="auto"/>
-              <w:rPr>
-                <w:rFonts w:ascii="Courier New" w:eastAsia="Times New Roman" w:hAnsi="Courier New" w:cs="Courier New"/>
-                <w:color w:val="000000"/>
-                <w:sz w:val="16"/>
-                <w:szCs w:val="16"/>
-                <w:lang w:val="en-US"/>
-              </w:rPr>
-            </w:pPr>
-            <w:r>
-              <w:rPr>
-                <w:rFonts w:ascii="Courier New" w:eastAsia="Times New Roman" w:hAnsi="Courier New" w:cs="Courier New"/>
-                <w:color w:val="000000"/>
-                <w:sz w:val="16"/>
-                <w:szCs w:val="16"/>
-                <w:lang w:val="en-US"/>
-              </w:rPr>
-              <w:t xml:space="preserve">   "value": float</w:t>
-            </w:r>
-          </w:p>
-          <w:p>
-            <w:pPr>
-              <w:spacing w:after="0" w:line="240" w:lineRule="auto"/>
-              <w:rPr>
-                <w:rFonts w:ascii="Courier New" w:eastAsia="Times New Roman" w:hAnsi="Courier New" w:cs="Courier New"/>
-                <w:color w:val="000000"/>
-                <w:sz w:val="16"/>
-                <w:szCs w:val="16"/>
-                <w:lang w:val="en-US"/>
-              </w:rPr>
-            </w:pPr>
-            <w:r>
-              <w:rPr>
-                <w:rFonts w:ascii="Courier New" w:eastAsia="Times New Roman" w:hAnsi="Courier New" w:cs="Courier New"/>
-                <w:color w:val="000000"/>
-                <w:sz w:val="16"/>
-                <w:szCs w:val="16"/>
-                <w:lang w:val="en-US"/>
-              </w:rPr>
-              <w:t xml:space="preserve">  },</w:t>
-            </w:r>
-          </w:p>
-          <w:p>
-            <w:pPr>
-              <w:spacing w:after="0" w:line="240" w:lineRule="auto"/>
-              <w:rPr>
-                <w:rFonts w:ascii="Courier New" w:eastAsia="Times New Roman" w:hAnsi="Courier New" w:cs="Courier New"/>
-                <w:color w:val="000000"/>
-                <w:sz w:val="16"/>
-                <w:szCs w:val="16"/>
-                <w:lang w:val="en-US"/>
-              </w:rPr>
-            </w:pPr>
-            <w:r>
-              <w:rPr>
-                <w:rFonts w:ascii="Courier New" w:eastAsia="Times New Roman" w:hAnsi="Courier New" w:cs="Courier New"/>
-                <w:color w:val="000000"/>
-                <w:sz w:val="16"/>
-                <w:szCs w:val="16"/>
-                <w:lang w:val="en-US"/>
-              </w:rPr>
-              <w:t xml:space="preserve"> …</w:t>
-            </w:r>
-          </w:p>
-          <w:p>
-            <w:pPr>
-              <w:spacing w:after="0" w:line="240" w:lineRule="auto"/>
-              <w:rPr>
-                <w:rFonts w:ascii="Courier New" w:eastAsia="Times New Roman" w:hAnsi="Courier New" w:cs="Courier New"/>
-                <w:color w:val="000000"/>
-                <w:sz w:val="16"/>
-                <w:szCs w:val="16"/>
-                <w:lang w:val="en-US"/>
-              </w:rPr>
-            </w:pPr>
-            <w:r>
-              <w:rPr>
-                <w:rFonts w:ascii="Courier New" w:eastAsia="Times New Roman" w:hAnsi="Courier New" w:cs="Courier New"/>
-                <w:color w:val="000000"/>
-                <w:sz w:val="16"/>
-                <w:szCs w:val="16"/>
-                <w:lang w:val="en-US"/>
-              </w:rPr>
-              <w:t>],</w:t>
-            </w:r>
-          </w:p>
-          <w:p>
-            <w:pPr>
-              <w:spacing w:after="0" w:line="240" w:lineRule="auto"/>
-              <w:rPr>
-                <w:rFonts w:ascii="Courier New" w:eastAsia="Times New Roman" w:hAnsi="Courier New" w:cs="Courier New"/>
-                <w:color w:val="000000"/>
-                <w:sz w:val="16"/>
-                <w:szCs w:val="16"/>
-                <w:lang w:val="en-US"/>
-              </w:rPr>
-            </w:pPr>
-            <w:r>
-              <w:rPr>
-                <w:rFonts w:ascii="Courier New" w:eastAsia="Times New Roman" w:hAnsi="Courier New" w:cs="Courier New"/>
-                <w:color w:val="000000"/>
-                <w:sz w:val="16"/>
-                <w:szCs w:val="16"/>
-                <w:lang w:val="en-US"/>
-              </w:rPr>
-              <w:t>"charge": [</w:t>
-            </w:r>
-          </w:p>
-          <w:p>
-            <w:pPr>
-              <w:spacing w:after="0" w:line="240" w:lineRule="auto"/>
-              <w:rPr>
-                <w:rFonts w:ascii="Courier New" w:eastAsia="Times New Roman" w:hAnsi="Courier New" w:cs="Courier New"/>
-                <w:color w:val="000000"/>
-                <w:sz w:val="16"/>
-                <w:szCs w:val="16"/>
-                <w:lang w:val="en-US"/>
-              </w:rPr>
-            </w:pPr>
-            <w:r>
-              <w:rPr>
-                <w:rFonts w:ascii="Courier New" w:eastAsia="Times New Roman" w:hAnsi="Courier New" w:cs="Courier New"/>
-                <w:color w:val="000000"/>
-                <w:sz w:val="16"/>
-                <w:szCs w:val="16"/>
-                <w:lang w:val="en-US"/>
-              </w:rPr>
-              <w:t xml:space="preserve">  {</w:t>
-            </w:r>
-          </w:p>
-          <w:p>
-            <w:pPr>
-              <w:spacing w:after="0" w:line="240" w:lineRule="auto"/>
-              <w:rPr>
-                <w:rFonts w:ascii="Courier New" w:eastAsia="Times New Roman" w:hAnsi="Courier New" w:cs="Courier New"/>
-                <w:color w:val="000000"/>
-                <w:sz w:val="16"/>
-                <w:szCs w:val="16"/>
-                <w:lang w:val="en-US"/>
-              </w:rPr>
-            </w:pPr>
-            <w:r>
-              <w:rPr>
-                <w:rFonts w:ascii="Courier New" w:eastAsia="Times New Roman" w:hAnsi="Courier New" w:cs="Courier New"/>
-                <w:color w:val="000000"/>
-                <w:sz w:val="16"/>
-                <w:szCs w:val="16"/>
-                <w:lang w:val="en-US"/>
-              </w:rPr>
-              <w:t xml:space="preserve">    "time": string,</w:t>
-            </w:r>
-          </w:p>
-          <w:p>
-            <w:pPr>
-              <w:spacing w:after="0" w:line="240" w:lineRule="auto"/>
-              <w:rPr>
-                <w:rFonts w:ascii="Courier New" w:eastAsia="Times New Roman" w:hAnsi="Courier New" w:cs="Courier New"/>
-                <w:color w:val="000000"/>
-                <w:sz w:val="16"/>
-                <w:szCs w:val="16"/>
-                <w:lang w:val="en-US"/>
-              </w:rPr>
-            </w:pPr>
-            <w:r>
-              <w:rPr>
-                <w:rFonts w:ascii="Courier New" w:eastAsia="Times New Roman" w:hAnsi="Courier New" w:cs="Courier New"/>
-                <w:color w:val="000000"/>
-                <w:sz w:val="16"/>
-                <w:szCs w:val="16"/>
-                <w:lang w:val="en-US"/>
-              </w:rPr>
-              <w:t xml:space="preserve">    "value": float</w:t>
-            </w:r>
-          </w:p>
-          <w:p>
-            <w:pPr>
-              <w:spacing w:after="0" w:line="240" w:lineRule="auto"/>
-              <w:rPr>
-                <w:rFonts w:ascii="Courier New" w:eastAsia="Times New Roman" w:hAnsi="Courier New" w:cs="Courier New"/>
-                <w:color w:val="000000"/>
-                <w:sz w:val="16"/>
-                <w:szCs w:val="16"/>
-                <w:lang w:val="en-US"/>
-              </w:rPr>
-            </w:pPr>
-            <w:r>
-              <w:rPr>
-                <w:rFonts w:ascii="Courier New" w:eastAsia="Times New Roman" w:hAnsi="Courier New" w:cs="Courier New"/>
-                <w:color w:val="000000"/>
-                <w:sz w:val="16"/>
-                <w:szCs w:val="16"/>
-                <w:lang w:val="en-US"/>
-              </w:rPr>
-              <w:t xml:space="preserve">  },</w:t>
-            </w:r>
-          </w:p>
-          <w:p>
-            <w:pPr>
-              <w:spacing w:after="0" w:line="240" w:lineRule="auto"/>
-              <w:rPr>
-                <w:rFonts w:ascii="Courier New" w:eastAsia="Times New Roman" w:hAnsi="Courier New" w:cs="Courier New"/>
-                <w:color w:val="000000"/>
-                <w:sz w:val="16"/>
-                <w:szCs w:val="16"/>
-                <w:lang w:val="en-US"/>
-              </w:rPr>
-            </w:pPr>
-            <w:r>
-              <w:rPr>
-                <w:rFonts w:ascii="Courier New" w:eastAsia="Times New Roman" w:hAnsi="Courier New" w:cs="Courier New"/>
-                <w:color w:val="000000"/>
-                <w:sz w:val="16"/>
-                <w:szCs w:val="16"/>
-                <w:lang w:val="en-US"/>
-              </w:rPr>
-              <w:t xml:space="preserve">  …</w:t>
-            </w:r>
-          </w:p>
-          <w:p>
-            <w:pPr>
-              <w:spacing w:after="0" w:line="240" w:lineRule="auto"/>
-              <w:rPr>
-                <w:rFonts w:ascii="Courier New" w:eastAsia="Times New Roman" w:hAnsi="Courier New" w:cs="Courier New"/>
-                <w:color w:val="000000"/>
-                <w:sz w:val="16"/>
-                <w:szCs w:val="16"/>
-                <w:lang w:val="en-US"/>
-              </w:rPr>
-            </w:pPr>
-            <w:r>
-              <w:rPr>
-                <w:rFonts w:ascii="Courier New" w:eastAsia="Times New Roman" w:hAnsi="Courier New" w:cs="Courier New"/>
-                <w:color w:val="000000"/>
-                <w:sz w:val="16"/>
-                <w:szCs w:val="16"/>
-                <w:lang w:val="en-US"/>
-              </w:rPr>
-              <w:t>],</w:t>
-            </w:r>
-          </w:p>
-          <w:p>
-            <w:pPr>
-              <w:spacing w:after="0" w:line="240" w:lineRule="auto"/>
-              <w:rPr>
-                <w:rFonts w:ascii="Courier New" w:eastAsia="Times New Roman" w:hAnsi="Courier New" w:cs="Courier New"/>
-                <w:color w:val="000000"/>
-                <w:sz w:val="16"/>
-                <w:szCs w:val="16"/>
-                <w:lang w:val="en-US"/>
-              </w:rPr>
-            </w:pPr>
-            <w:r>
-              <w:rPr>
-                <w:rFonts w:ascii="Courier New" w:eastAsia="Times New Roman" w:hAnsi="Courier New" w:cs="Courier New"/>
-                <w:color w:val="000000"/>
-                <w:sz w:val="16"/>
-                <w:szCs w:val="16"/>
-                <w:lang w:val="en-US"/>
-              </w:rPr>
-              <w:t>"production": [</w:t>
-            </w:r>
-          </w:p>
-          <w:p>
-            <w:pPr>
-              <w:spacing w:after="0" w:line="240" w:lineRule="auto"/>
-              <w:rPr>
-                <w:rFonts w:ascii="Courier New" w:eastAsia="Times New Roman" w:hAnsi="Courier New" w:cs="Courier New"/>
-                <w:color w:val="000000"/>
-                <w:sz w:val="16"/>
-                <w:szCs w:val="16"/>
-                <w:lang w:val="en-US"/>
-              </w:rPr>
-            </w:pPr>
-            <w:r>
-              <w:rPr>
-                <w:rFonts w:ascii="Courier New" w:eastAsia="Times New Roman" w:hAnsi="Courier New" w:cs="Courier New"/>
-                <w:color w:val="000000"/>
-                <w:sz w:val="16"/>
-                <w:szCs w:val="16"/>
-                <w:lang w:val="en-US"/>
-              </w:rPr>
-              <w:t xml:space="preserve">  </w:t>
-            </w:r>
-            <w:r>
-              <w:rPr>
-                <w:rFonts w:ascii="Courier New" w:eastAsia="Times New Roman" w:hAnsi="Courier New" w:cs="Courier New"/>
-                <w:color w:val="000000"/>
-                <w:sz w:val="16"/>
-                <w:szCs w:val="16"/>
-                <w:lang w:val="en-US"/>
-              </w:rPr>
-              <w:t>{</w:t>
-            </w:r>
-          </w:p>
-          <w:p>
-            <w:pPr>
-              <w:spacing w:after="0" w:line="240" w:lineRule="auto"/>
-              <w:rPr>
-                <w:rFonts w:ascii="Courier New" w:eastAsia="Times New Roman" w:hAnsi="Courier New" w:cs="Courier New"/>
-                <w:color w:val="000000"/>
-                <w:sz w:val="16"/>
-                <w:szCs w:val="16"/>
-                <w:lang w:val="en-US"/>
-              </w:rPr>
-            </w:pPr>
-            <w:r>
-              <w:rPr>
-                <w:rFonts w:ascii="Courier New" w:eastAsia="Times New Roman" w:hAnsi="Courier New" w:cs="Courier New"/>
-                <w:color w:val="000000"/>
-                <w:sz w:val="16"/>
-                <w:szCs w:val="16"/>
-                <w:lang w:val="en-US"/>
-              </w:rPr>
-              <w:t xml:space="preserve">   "time": string,</w:t>
-            </w:r>
-          </w:p>
-          <w:p>
-            <w:pPr>
-              <w:spacing w:after="0" w:line="240" w:lineRule="auto"/>
-              <w:rPr>
-                <w:rFonts w:ascii="Courier New" w:eastAsia="Times New Roman" w:hAnsi="Courier New" w:cs="Courier New"/>
-                <w:color w:val="000000"/>
-                <w:sz w:val="16"/>
-                <w:szCs w:val="16"/>
-                <w:lang w:val="en-US"/>
-              </w:rPr>
-            </w:pPr>
-            <w:r>
-              <w:rPr>
-                <w:rFonts w:ascii="Courier New" w:eastAsia="Times New Roman" w:hAnsi="Courier New" w:cs="Courier New"/>
-                <w:color w:val="000000"/>
-                <w:sz w:val="16"/>
-                <w:szCs w:val="16"/>
-                <w:lang w:val="en-US"/>
-              </w:rPr>
-              <w:t xml:space="preserve">   "value": float</w:t>
-            </w:r>
-          </w:p>
-          <w:p>
-            <w:pPr>
-              <w:spacing w:after="0" w:line="240" w:lineRule="auto"/>
-              <w:rPr>
-                <w:rFonts w:ascii="Courier New" w:eastAsia="Times New Roman" w:hAnsi="Courier New" w:cs="Courier New"/>
-                <w:color w:val="000000"/>
-                <w:sz w:val="16"/>
-                <w:szCs w:val="16"/>
-                <w:lang w:val="en-US"/>
-              </w:rPr>
-            </w:pPr>
-            <w:r>
-              <w:rPr>
-                <w:rFonts w:ascii="Courier New" w:eastAsia="Times New Roman" w:hAnsi="Courier New" w:cs="Courier New"/>
-                <w:color w:val="000000"/>
-                <w:sz w:val="16"/>
-                <w:szCs w:val="16"/>
-                <w:lang w:val="en-US"/>
-              </w:rPr>
-              <w:t xml:space="preserve">  },</w:t>
-            </w:r>
-          </w:p>
-          <w:p>
-            <w:pPr>
-              <w:spacing w:after="0" w:line="240" w:lineRule="auto"/>
-              <w:rPr>
-                <w:rFonts w:ascii="Courier New" w:eastAsia="Times New Roman" w:hAnsi="Courier New" w:cs="Courier New"/>
-                <w:color w:val="000000"/>
-                <w:sz w:val="16"/>
-                <w:szCs w:val="16"/>
-                <w:lang w:val="en-US"/>
-              </w:rPr>
-            </w:pPr>
-            <w:r>
-              <w:rPr>
-                <w:rFonts w:ascii="Courier New" w:eastAsia="Times New Roman" w:hAnsi="Courier New" w:cs="Courier New"/>
-                <w:color w:val="000000"/>
-                <w:sz w:val="16"/>
-                <w:szCs w:val="16"/>
-                <w:lang w:val="en-US"/>
-              </w:rPr>
-              <w:t xml:space="preserve"> …</w:t>
-            </w:r>
-          </w:p>
-          <w:p>
-            <w:pPr>
-              <w:spacing w:after="0" w:line="240" w:lineRule="auto"/>
-              <w:rPr>
-                <w:rFonts w:ascii="Courier New" w:eastAsia="Times New Roman" w:hAnsi="Courier New" w:cs="Courier New"/>
-                <w:color w:val="000000"/>
-                <w:sz w:val="16"/>
-                <w:szCs w:val="16"/>
-                <w:lang w:val="en-US"/>
-              </w:rPr>
-            </w:pPr>
-            <w:r>
-              <w:rPr>
-                <w:rFonts w:ascii="Courier New" w:eastAsia="Times New Roman" w:hAnsi="Courier New" w:cs="Courier New"/>
-                <w:color w:val="000000"/>
-                <w:sz w:val="16"/>
-                <w:szCs w:val="16"/>
-                <w:lang w:val="en-US"/>
-              </w:rPr>
-              <w:lastRenderedPageBreak/>
-              <w:t>],</w:t>
-            </w:r>
-          </w:p>
-          <w:p>
-            <w:pPr>
-              <w:spacing w:after="0" w:line="240" w:lineRule="auto"/>
-              <w:rPr>
-                <w:rFonts w:ascii="Courier New" w:eastAsia="Times New Roman" w:hAnsi="Courier New" w:cs="Courier New"/>
-                <w:color w:val="000000"/>
-                <w:sz w:val="16"/>
-                <w:szCs w:val="16"/>
-                <w:lang w:val="en-US"/>
-              </w:rPr>
-            </w:pPr>
-            <w:r>
-              <w:rPr>
-                <w:rFonts w:ascii="Courier New" w:eastAsia="Times New Roman" w:hAnsi="Courier New" w:cs="Courier New"/>
-                <w:color w:val="000000"/>
-                <w:sz w:val="16"/>
-                <w:szCs w:val="16"/>
-                <w:lang w:val="en-US"/>
-              </w:rPr>
-              <w:t>"consumption": [</w:t>
-            </w:r>
-          </w:p>
-          <w:p>
-            <w:pPr>
-              <w:spacing w:after="0" w:line="240" w:lineRule="auto"/>
-              <w:rPr>
-                <w:rFonts w:ascii="Courier New" w:eastAsia="Times New Roman" w:hAnsi="Courier New" w:cs="Courier New"/>
-                <w:color w:val="000000"/>
-                <w:sz w:val="16"/>
-                <w:szCs w:val="16"/>
-                <w:lang w:val="en-US"/>
-              </w:rPr>
-            </w:pPr>
-            <w:r>
-              <w:rPr>
-                <w:rFonts w:ascii="Courier New" w:eastAsia="Times New Roman" w:hAnsi="Courier New" w:cs="Courier New"/>
-                <w:color w:val="000000"/>
-                <w:sz w:val="16"/>
-                <w:szCs w:val="16"/>
-                <w:lang w:val="en-US"/>
-              </w:rPr>
-              <w:t xml:space="preserve">  {</w:t>
-            </w:r>
-          </w:p>
-          <w:p>
-            <w:pPr>
-              <w:spacing w:after="0" w:line="240" w:lineRule="auto"/>
-              <w:rPr>
-                <w:rFonts w:ascii="Courier New" w:eastAsia="Times New Roman" w:hAnsi="Courier New" w:cs="Courier New"/>
-                <w:color w:val="000000"/>
-                <w:sz w:val="16"/>
-                <w:szCs w:val="16"/>
-                <w:lang w:val="en-US"/>
-              </w:rPr>
-            </w:pPr>
-            <w:r>
-              <w:rPr>
-                <w:rFonts w:ascii="Courier New" w:eastAsia="Times New Roman" w:hAnsi="Courier New" w:cs="Courier New"/>
-                <w:color w:val="000000"/>
-                <w:sz w:val="16"/>
-                <w:szCs w:val="16"/>
-                <w:lang w:val="en-US"/>
-              </w:rPr>
-              <w:t xml:space="preserve">   "time": string</w:t>
-            </w:r>
-          </w:p>
-          <w:p>
-            <w:pPr>
-              <w:spacing w:after="0" w:line="240" w:lineRule="auto"/>
-              <w:rPr>
-                <w:rFonts w:ascii="Courier New" w:eastAsia="Times New Roman" w:hAnsi="Courier New" w:cs="Courier New"/>
-                <w:color w:val="000000"/>
-                <w:sz w:val="16"/>
-                <w:szCs w:val="16"/>
-                <w:lang w:val="en-US"/>
-              </w:rPr>
-            </w:pPr>
-            <w:r>
-              <w:rPr>
-                <w:rFonts w:ascii="Courier New" w:eastAsia="Times New Roman" w:hAnsi="Courier New" w:cs="Courier New"/>
-                <w:color w:val="000000"/>
-                <w:sz w:val="16"/>
-                <w:szCs w:val="16"/>
-                <w:lang w:val="en-US"/>
-              </w:rPr>
-              <w:t xml:space="preserve">   "value": float</w:t>
-            </w:r>
-          </w:p>
-          <w:p>
-            <w:pPr>
-              <w:spacing w:after="0" w:line="240" w:lineRule="auto"/>
-              <w:rPr>
-                <w:rFonts w:ascii="Courier New" w:eastAsia="Times New Roman" w:hAnsi="Courier New" w:cs="Courier New"/>
-                <w:color w:val="000000"/>
-                <w:sz w:val="16"/>
-                <w:szCs w:val="16"/>
-                <w:lang w:val="en-US"/>
-              </w:rPr>
-            </w:pPr>
-            <w:r>
-              <w:rPr>
-                <w:rFonts w:ascii="Courier New" w:eastAsia="Times New Roman" w:hAnsi="Courier New" w:cs="Courier New"/>
-                <w:color w:val="000000"/>
-                <w:sz w:val="16"/>
-                <w:szCs w:val="16"/>
-                <w:lang w:val="en-US"/>
-              </w:rPr>
-              <w:t xml:space="preserve">  }</w:t>
-            </w:r>
-          </w:p>
-          <w:p>
-            <w:pPr>
-              <w:spacing w:after="0" w:line="240" w:lineRule="auto"/>
-              <w:rPr>
-                <w:rFonts w:ascii="Courier New" w:eastAsia="Times New Roman" w:hAnsi="Courier New" w:cs="Courier New"/>
-                <w:color w:val="000000"/>
-                <w:sz w:val="16"/>
-                <w:szCs w:val="16"/>
-                <w:lang w:val="en-US"/>
-              </w:rPr>
-            </w:pPr>
-            <w:r>
-              <w:rPr>
-                <w:rFonts w:ascii="Courier New" w:eastAsia="Times New Roman" w:hAnsi="Courier New" w:cs="Courier New"/>
-                <w:color w:val="000000"/>
-                <w:sz w:val="16"/>
-                <w:szCs w:val="16"/>
-                <w:lang w:val="en-US"/>
-              </w:rPr>
-              <w:t xml:space="preserve"> …</w:t>
-            </w:r>
-          </w:p>
-          <w:p>
-            <w:pPr>
-              <w:spacing w:after="0" w:line="240" w:lineRule="auto"/>
-              <w:rPr>
-                <w:rFonts w:ascii="Courier New" w:eastAsia="Times New Roman" w:hAnsi="Courier New" w:cs="Courier New"/>
-                <w:color w:val="000000"/>
-                <w:sz w:val="16"/>
-                <w:szCs w:val="16"/>
-                <w:lang w:val="en-US"/>
-              </w:rPr>
-            </w:pPr>
-            <w:r>
-              <w:rPr>
-                <w:rFonts w:ascii="Courier New" w:eastAsia="Times New Roman" w:hAnsi="Courier New" w:cs="Courier New"/>
-                <w:color w:val="000000"/>
-                <w:sz w:val="16"/>
-                <w:szCs w:val="16"/>
-                <w:lang w:val="en-US"/>
-              </w:rPr>
-              <w:t>,</w:t>
-            </w:r>
-          </w:p>
-          <w:p>
-            <w:pPr>
-              <w:spacing w:after="0" w:line="240" w:lineRule="auto"/>
-              <w:rPr>
-                <w:rFonts w:ascii="Courier New" w:eastAsia="Times New Roman" w:hAnsi="Courier New" w:cs="Courier New"/>
-                <w:color w:val="000000"/>
-                <w:sz w:val="16"/>
-                <w:szCs w:val="16"/>
-                <w:lang w:val="en-US"/>
-              </w:rPr>
-            </w:pPr>
-            <w:r>
-              <w:rPr>
-                <w:rFonts w:ascii="Courier New" w:eastAsia="Times New Roman" w:hAnsi="Courier New" w:cs="Courier New"/>
-                <w:color w:val="000000"/>
-                <w:sz w:val="16"/>
-                <w:szCs w:val="16"/>
-                <w:lang w:val="en-US"/>
-              </w:rPr>
               <w:t>"</w:t>
             </w:r>
             <w:proofErr w:type="spellStart"/>
@@ -5087,7 +4557,7 @@
                 <w:szCs w:val="16"/>
                 <w:lang w:val="en-US"/>
               </w:rPr>
-              <w:t>feed</w:t>
+              <w:t>production</w:t>
             </w:r>
             <w:proofErr w:type="gramEnd"/>
             <w:r>
@@ -5098,7 +4568,7 @@
                 <w:szCs w:val="16"/>
                 <w:lang w:val="en-US"/>
               </w:rPr>
-              <w:t>_in</w:t>
+              <w:t>_current</w:t>
             </w:r>
             <w:proofErr w:type="spellEnd"/>
             <w:r>
@@ -5109,139 +4579,17 @@
                 <w:szCs w:val="16"/>
                 <w:lang w:val="en-US"/>
               </w:rPr>
-              <w:t>": [</w:t>
-            </w:r>
-          </w:p>
-          <w:p>
-            <w:pPr>
-              <w:spacing w:after="0" w:line="240" w:lineRule="auto"/>
-              <w:rPr>
-                <w:rFonts w:ascii="Courier New" w:eastAsia="Times New Roman" w:hAnsi="Courier New" w:cs="Courier New"/>
-                <w:color w:val="000000"/>
-                <w:sz w:val="16"/>
-                <w:szCs w:val="16"/>
-                <w:lang w:val="en-US"/>
-              </w:rPr>
-            </w:pPr>
-            <w:r>
-              <w:rPr>
-                <w:rFonts w:ascii="Courier New" w:eastAsia="Times New Roman" w:hAnsi="Courier New" w:cs="Courier New"/>
-                <w:color w:val="000000"/>
-                <w:sz w:val="16"/>
-                <w:szCs w:val="16"/>
-                <w:lang w:val="en-US"/>
-              </w:rPr>
-              <w:t xml:space="preserve"> {</w:t>
-            </w:r>
-          </w:p>
-          <w:p>
-            <w:pPr>
-              <w:spacing w:after="0" w:line="240" w:lineRule="auto"/>
-              <w:rPr>
-                <w:rFonts w:ascii="Courier New" w:eastAsia="Times New Roman" w:hAnsi="Courier New" w:cs="Courier New"/>
-                <w:color w:val="000000"/>
-                <w:sz w:val="16"/>
-                <w:szCs w:val="16"/>
-                <w:lang w:val="en-US"/>
-              </w:rPr>
-            </w:pPr>
-            <w:r>
-              <w:rPr>
-                <w:rFonts w:ascii="Courier New" w:eastAsia="Times New Roman" w:hAnsi="Courier New" w:cs="Courier New"/>
-                <w:color w:val="000000"/>
-                <w:sz w:val="16"/>
-                <w:szCs w:val="16"/>
-                <w:lang w:val="en-US"/>
-              </w:rPr>
-              <w:t xml:space="preserve">  "time": string,</w:t>
-            </w:r>
-          </w:p>
-          <w:p>
-            <w:pPr>
-              <w:spacing w:after="0" w:line="240" w:lineRule="auto"/>
-              <w:rPr>
-                <w:rFonts w:ascii="Courier New" w:eastAsia="Times New Roman" w:hAnsi="Courier New" w:cs="Courier New"/>
-                <w:color w:val="000000"/>
-                <w:sz w:val="16"/>
-                <w:szCs w:val="16"/>
-                <w:lang w:val="en-US"/>
-              </w:rPr>
-            </w:pPr>
-            <w:r>
-              <w:rPr>
-                <w:rFonts w:ascii="Courier New" w:eastAsia="Times New Roman" w:hAnsi="Courier New" w:cs="Courier New"/>
-                <w:color w:val="000000"/>
-                <w:sz w:val="16"/>
-                <w:szCs w:val="16"/>
-                <w:lang w:val="en-US"/>
-              </w:rPr>
-              <w:t xml:space="preserve">   "value": float</w:t>
-            </w:r>
-          </w:p>
-          <w:p>
-            <w:pPr>
-              <w:spacing w:after="0" w:line="240" w:lineRule="auto"/>
-              <w:rPr>
-                <w:rFonts w:ascii="Courier New" w:eastAsia="Times New Roman" w:hAnsi="Courier New" w:cs="Courier New"/>
-                <w:color w:val="000000"/>
-                <w:sz w:val="16"/>
-                <w:szCs w:val="16"/>
-                <w:lang w:val="en-US"/>
-              </w:rPr>
-            </w:pPr>
-            <w:r>
-              <w:rPr>
-                <w:rFonts w:ascii="Courier New" w:eastAsia="Times New Roman" w:hAnsi="Courier New" w:cs="Courier New"/>
-                <w:color w:val="000000"/>
-                <w:sz w:val="16"/>
-                <w:szCs w:val="16"/>
-                <w:lang w:val="en-US"/>
-              </w:rPr>
-              <w:t xml:space="preserve"> },</w:t>
-            </w:r>
-          </w:p>
-          <w:p>
-            <w:pPr>
-              <w:spacing w:after="0" w:line="240" w:lineRule="auto"/>
-              <w:rPr>
-                <w:rFonts w:ascii="Courier New" w:eastAsia="Times New Roman" w:hAnsi="Courier New" w:cs="Courier New"/>
-                <w:color w:val="000000"/>
-                <w:sz w:val="16"/>
-                <w:szCs w:val="16"/>
-                <w:lang w:val="en-US"/>
-              </w:rPr>
-            </w:pPr>
-            <w:r>
-              <w:rPr>
-                <w:rFonts w:ascii="Courier New" w:eastAsia="Times New Roman" w:hAnsi="Courier New" w:cs="Courier New"/>
-                <w:color w:val="000000"/>
-                <w:sz w:val="16"/>
-                <w:szCs w:val="16"/>
-                <w:lang w:val="en-US"/>
-              </w:rPr>
-              <w:t xml:space="preserve"> …</w:t>
-            </w:r>
-          </w:p>
-          <w:p>
-            <w:pPr>
-              <w:spacing w:after="0" w:line="240" w:lineRule="auto"/>
-              <w:rPr>
-                <w:rFonts w:ascii="Courier New" w:eastAsia="Times New Roman" w:hAnsi="Courier New" w:cs="Courier New"/>
-                <w:color w:val="000000"/>
-                <w:sz w:val="16"/>
-                <w:szCs w:val="16"/>
-                <w:lang w:val="en-US"/>
-              </w:rPr>
-            </w:pPr>
-            <w:r>
-              <w:rPr>
-                <w:rFonts w:ascii="Courier New" w:eastAsia="Times New Roman" w:hAnsi="Courier New" w:cs="Courier New"/>
-                <w:color w:val="000000"/>
-                <w:sz w:val="16"/>
-                <w:szCs w:val="16"/>
-                <w:lang w:val="en-US"/>
-              </w:rPr>
-              <w:t>],</w:t>
+              <w:t>"</w:t>
+            </w:r>
+            <w:r>
+              <w:rPr>
+                <w:rFonts w:ascii="Courier New" w:eastAsia="Times New Roman" w:hAnsi="Courier New" w:cs="Courier New"/>
+                <w:color w:val="000000"/>
+                <w:sz w:val="16"/>
+                <w:szCs w:val="16"/>
+                <w:lang w:val="en-US"/>
+              </w:rPr>
+              <w:t>: float,</w:t>
             </w:r>
           </w:p>
           <w:p>
@@ -5275,6 +4623,887 @@
                 <w:szCs w:val="16"/>
                 <w:lang w:val="en-US"/>
               </w:rPr>
+              <w:t>consumption</w:t>
+            </w:r>
+            <w:proofErr w:type="gramEnd"/>
+            <w:r>
+              <w:rPr>
+                <w:rFonts w:ascii="Courier New" w:eastAsia="Times New Roman" w:hAnsi="Courier New" w:cs="Courier New"/>
+                <w:color w:val="000000"/>
+                <w:sz w:val="16"/>
+                <w:szCs w:val="16"/>
+                <w:lang w:val="en-US"/>
+              </w:rPr>
+              <w:t>_current</w:t>
+            </w:r>
+            <w:proofErr w:type="spellEnd"/>
+            <w:r>
+              <w:rPr>
+                <w:rFonts w:ascii="Courier New" w:eastAsia="Times New Roman" w:hAnsi="Courier New" w:cs="Courier New"/>
+                <w:color w:val="000000"/>
+                <w:sz w:val="16"/>
+                <w:szCs w:val="16"/>
+                <w:lang w:val="en-US"/>
+              </w:rPr>
+              <w:t>"</w:t>
+            </w:r>
+            <w:r>
+              <w:rPr>
+                <w:rFonts w:ascii="Courier New" w:eastAsia="Times New Roman" w:hAnsi="Courier New" w:cs="Courier New"/>
+                <w:color w:val="000000"/>
+                <w:sz w:val="16"/>
+                <w:szCs w:val="16"/>
+                <w:lang w:val="en-US"/>
+              </w:rPr>
+              <w:t>: float,</w:t>
+            </w:r>
+          </w:p>
+          <w:p>
+            <w:pPr>
+              <w:spacing w:after="0" w:line="240" w:lineRule="auto"/>
+              <w:rPr>
+                <w:rFonts w:ascii="Courier New" w:eastAsia="Times New Roman" w:hAnsi="Courier New" w:cs="Courier New"/>
+                <w:color w:val="000000"/>
+                <w:sz w:val="16"/>
+                <w:szCs w:val="16"/>
+                <w:lang w:val="en-US"/>
+              </w:rPr>
+            </w:pPr>
+            <w:r>
+              <w:rPr>
+                <w:rFonts w:ascii="Courier New" w:eastAsia="Times New Roman" w:hAnsi="Courier New" w:cs="Courier New"/>
+                <w:color w:val="000000"/>
+                <w:sz w:val="16"/>
+                <w:szCs w:val="16"/>
+                <w:lang w:val="en-US"/>
+              </w:rPr>
+              <w:t>"discharge": [</w:t>
+            </w:r>
+          </w:p>
+          <w:p>
+            <w:pPr>
+              <w:spacing w:after="0" w:line="240" w:lineRule="auto"/>
+              <w:rPr>
+                <w:rFonts w:ascii="Courier New" w:eastAsia="Times New Roman" w:hAnsi="Courier New" w:cs="Courier New"/>
+                <w:color w:val="000000"/>
+                <w:sz w:val="16"/>
+                <w:szCs w:val="16"/>
+                <w:lang w:val="en-US"/>
+              </w:rPr>
+            </w:pPr>
+            <w:r>
+              <w:rPr>
+                <w:rFonts w:ascii="Courier New" w:eastAsia="Times New Roman" w:hAnsi="Courier New" w:cs="Courier New"/>
+                <w:color w:val="000000"/>
+                <w:sz w:val="16"/>
+                <w:szCs w:val="16"/>
+                <w:lang w:val="en-US"/>
+              </w:rPr>
+              <w:t xml:space="preserve">  {</w:t>
+            </w:r>
+          </w:p>
+          <w:p>
+            <w:pPr>
+              <w:spacing w:after="0" w:line="240" w:lineRule="auto"/>
+              <w:rPr>
+                <w:rFonts w:ascii="Courier New" w:eastAsia="Times New Roman" w:hAnsi="Courier New" w:cs="Courier New"/>
+                <w:color w:val="000000"/>
+                <w:sz w:val="16"/>
+                <w:szCs w:val="16"/>
+                <w:lang w:val="en-US"/>
+              </w:rPr>
+            </w:pPr>
+            <w:r>
+              <w:rPr>
+                <w:rFonts w:ascii="Courier New" w:eastAsia="Times New Roman" w:hAnsi="Courier New" w:cs="Courier New"/>
+                <w:color w:val="000000"/>
+                <w:sz w:val="16"/>
+                <w:szCs w:val="16"/>
+                <w:lang w:val="en-US"/>
+              </w:rPr>
+              <w:t xml:space="preserve">   "time": string,</w:t>
+            </w:r>
+          </w:p>
+          <w:p>
+            <w:pPr>
+              <w:spacing w:after="0" w:line="240" w:lineRule="auto"/>
+              <w:rPr>
+                <w:rFonts w:ascii="Courier New" w:eastAsia="Times New Roman" w:hAnsi="Courier New" w:cs="Courier New"/>
+                <w:color w:val="000000"/>
+                <w:sz w:val="16"/>
+                <w:szCs w:val="16"/>
+                <w:lang w:val="en-US"/>
+              </w:rPr>
+            </w:pPr>
+            <w:r>
+              <w:rPr>
+                <w:rFonts w:ascii="Courier New" w:eastAsia="Times New Roman" w:hAnsi="Courier New" w:cs="Courier New"/>
+                <w:color w:val="000000"/>
+                <w:sz w:val="16"/>
+                <w:szCs w:val="16"/>
+                <w:lang w:val="en-US"/>
+              </w:rPr>
+              <w:t xml:space="preserve">   "value": float</w:t>
+            </w:r>
+          </w:p>
+          <w:p>
+            <w:pPr>
+              <w:spacing w:after="0" w:line="240" w:lineRule="auto"/>
+              <w:rPr>
+                <w:rFonts w:ascii="Courier New" w:eastAsia="Times New Roman" w:hAnsi="Courier New" w:cs="Courier New"/>
+                <w:color w:val="000000"/>
+                <w:sz w:val="16"/>
+                <w:szCs w:val="16"/>
+                <w:lang w:val="en-US"/>
+              </w:rPr>
+            </w:pPr>
+            <w:r>
+              <w:rPr>
+                <w:rFonts w:ascii="Courier New" w:eastAsia="Times New Roman" w:hAnsi="Courier New" w:cs="Courier New"/>
+                <w:color w:val="000000"/>
+                <w:sz w:val="16"/>
+                <w:szCs w:val="16"/>
+                <w:lang w:val="en-US"/>
+              </w:rPr>
+              <w:t xml:space="preserve">  },</w:t>
+            </w:r>
+          </w:p>
+          <w:p>
+            <w:pPr>
+              <w:spacing w:after="0" w:line="240" w:lineRule="auto"/>
+              <w:rPr>
+                <w:rFonts w:ascii="Courier New" w:eastAsia="Times New Roman" w:hAnsi="Courier New" w:cs="Courier New"/>
+                <w:color w:val="000000"/>
+                <w:sz w:val="16"/>
+                <w:szCs w:val="16"/>
+                <w:lang w:val="en-US"/>
+              </w:rPr>
+            </w:pPr>
+            <w:r>
+              <w:rPr>
+                <w:rFonts w:ascii="Courier New" w:eastAsia="Times New Roman" w:hAnsi="Courier New" w:cs="Courier New"/>
+                <w:color w:val="000000"/>
+                <w:sz w:val="16"/>
+                <w:szCs w:val="16"/>
+                <w:lang w:val="en-US"/>
+              </w:rPr>
+              <w:t xml:space="preserve"> …</w:t>
+            </w:r>
+          </w:p>
+          <w:p>
+            <w:pPr>
+              <w:spacing w:after="0" w:line="240" w:lineRule="auto"/>
+              <w:rPr>
+                <w:rFonts w:ascii="Courier New" w:eastAsia="Times New Roman" w:hAnsi="Courier New" w:cs="Courier New"/>
+                <w:color w:val="000000"/>
+                <w:sz w:val="16"/>
+                <w:szCs w:val="16"/>
+                <w:lang w:val="en-US"/>
+              </w:rPr>
+            </w:pPr>
+            <w:r>
+              <w:rPr>
+                <w:rFonts w:ascii="Courier New" w:eastAsia="Times New Roman" w:hAnsi="Courier New" w:cs="Courier New"/>
+                <w:color w:val="000000"/>
+                <w:sz w:val="16"/>
+                <w:szCs w:val="16"/>
+                <w:lang w:val="en-US"/>
+              </w:rPr>
+              <w:t>],</w:t>
+            </w:r>
+          </w:p>
+          <w:p>
+            <w:pPr>
+              <w:spacing w:after="0" w:line="240" w:lineRule="auto"/>
+              <w:rPr>
+                <w:rFonts w:ascii="Courier New" w:eastAsia="Times New Roman" w:hAnsi="Courier New" w:cs="Courier New"/>
+                <w:color w:val="000000"/>
+                <w:sz w:val="16"/>
+                <w:szCs w:val="16"/>
+                <w:lang w:val="en-US"/>
+              </w:rPr>
+            </w:pPr>
+            <w:r>
+              <w:rPr>
+                <w:rFonts w:ascii="Courier New" w:eastAsia="Times New Roman" w:hAnsi="Courier New" w:cs="Courier New"/>
+                <w:color w:val="000000"/>
+                <w:sz w:val="16"/>
+                <w:szCs w:val="16"/>
+                <w:lang w:val="en-US"/>
+              </w:rPr>
+              <w:t>"charge": [</w:t>
+            </w:r>
+          </w:p>
+          <w:p>
+            <w:pPr>
+              <w:spacing w:after="0" w:line="240" w:lineRule="auto"/>
+              <w:rPr>
+                <w:rFonts w:ascii="Courier New" w:eastAsia="Times New Roman" w:hAnsi="Courier New" w:cs="Courier New"/>
+                <w:color w:val="000000"/>
+                <w:sz w:val="16"/>
+                <w:szCs w:val="16"/>
+                <w:lang w:val="en-US"/>
+              </w:rPr>
+            </w:pPr>
+            <w:r>
+              <w:rPr>
+                <w:rFonts w:ascii="Courier New" w:eastAsia="Times New Roman" w:hAnsi="Courier New" w:cs="Courier New"/>
+                <w:color w:val="000000"/>
+                <w:sz w:val="16"/>
+                <w:szCs w:val="16"/>
+                <w:lang w:val="en-US"/>
+              </w:rPr>
+              <w:t xml:space="preserve">  {</w:t>
+            </w:r>
+          </w:p>
+          <w:p>
+            <w:pPr>
+              <w:spacing w:after="0" w:line="240" w:lineRule="auto"/>
+              <w:rPr>
+                <w:rFonts w:ascii="Courier New" w:eastAsia="Times New Roman" w:hAnsi="Courier New" w:cs="Courier New"/>
+                <w:color w:val="000000"/>
+                <w:sz w:val="16"/>
+                <w:szCs w:val="16"/>
+                <w:lang w:val="en-US"/>
+              </w:rPr>
+            </w:pPr>
+            <w:r>
+              <w:rPr>
+                <w:rFonts w:ascii="Courier New" w:eastAsia="Times New Roman" w:hAnsi="Courier New" w:cs="Courier New"/>
+                <w:color w:val="000000"/>
+                <w:sz w:val="16"/>
+                <w:szCs w:val="16"/>
+                <w:lang w:val="en-US"/>
+              </w:rPr>
+              <w:t xml:space="preserve">    "time": string,</w:t>
+            </w:r>
+          </w:p>
+          <w:p>
+            <w:pPr>
+              <w:spacing w:after="0" w:line="240" w:lineRule="auto"/>
+              <w:rPr>
+                <w:rFonts w:ascii="Courier New" w:eastAsia="Times New Roman" w:hAnsi="Courier New" w:cs="Courier New"/>
+                <w:color w:val="000000"/>
+                <w:sz w:val="16"/>
+                <w:szCs w:val="16"/>
+                <w:lang w:val="en-US"/>
+              </w:rPr>
+            </w:pPr>
+            <w:r>
+              <w:rPr>
+                <w:rFonts w:ascii="Courier New" w:eastAsia="Times New Roman" w:hAnsi="Courier New" w:cs="Courier New"/>
+                <w:color w:val="000000"/>
+                <w:sz w:val="16"/>
+                <w:szCs w:val="16"/>
+                <w:lang w:val="en-US"/>
+              </w:rPr>
+              <w:t xml:space="preserve">    "value": float</w:t>
+            </w:r>
+          </w:p>
+          <w:p>
+            <w:pPr>
+              <w:spacing w:after="0" w:line="240" w:lineRule="auto"/>
+              <w:rPr>
+                <w:rFonts w:ascii="Courier New" w:eastAsia="Times New Roman" w:hAnsi="Courier New" w:cs="Courier New"/>
+                <w:color w:val="000000"/>
+                <w:sz w:val="16"/>
+                <w:szCs w:val="16"/>
+                <w:lang w:val="en-US"/>
+              </w:rPr>
+            </w:pPr>
+            <w:r>
+              <w:rPr>
+                <w:rFonts w:ascii="Courier New" w:eastAsia="Times New Roman" w:hAnsi="Courier New" w:cs="Courier New"/>
+                <w:color w:val="000000"/>
+                <w:sz w:val="16"/>
+                <w:szCs w:val="16"/>
+                <w:lang w:val="en-US"/>
+              </w:rPr>
+              <w:t xml:space="preserve">  },</w:t>
+            </w:r>
+          </w:p>
+          <w:p>
+            <w:pPr>
+              <w:spacing w:after="0" w:line="240" w:lineRule="auto"/>
+              <w:rPr>
+                <w:rFonts w:ascii="Courier New" w:eastAsia="Times New Roman" w:hAnsi="Courier New" w:cs="Courier New"/>
+                <w:color w:val="000000"/>
+                <w:sz w:val="16"/>
+                <w:szCs w:val="16"/>
+                <w:lang w:val="en-US"/>
+              </w:rPr>
+            </w:pPr>
+            <w:r>
+              <w:rPr>
+                <w:rFonts w:ascii="Courier New" w:eastAsia="Times New Roman" w:hAnsi="Courier New" w:cs="Courier New"/>
+                <w:color w:val="000000"/>
+                <w:sz w:val="16"/>
+                <w:szCs w:val="16"/>
+                <w:lang w:val="en-US"/>
+              </w:rPr>
+              <w:t xml:space="preserve">  …</w:t>
+            </w:r>
+          </w:p>
+          <w:p>
+            <w:pPr>
+              <w:spacing w:after="0" w:line="240" w:lineRule="auto"/>
+              <w:rPr>
+                <w:rFonts w:ascii="Courier New" w:eastAsia="Times New Roman" w:hAnsi="Courier New" w:cs="Courier New"/>
+                <w:color w:val="000000"/>
+                <w:sz w:val="16"/>
+                <w:szCs w:val="16"/>
+                <w:lang w:val="en-US"/>
+              </w:rPr>
+            </w:pPr>
+            <w:r>
+              <w:rPr>
+                <w:rFonts w:ascii="Courier New" w:eastAsia="Times New Roman" w:hAnsi="Courier New" w:cs="Courier New"/>
+                <w:color w:val="000000"/>
+                <w:sz w:val="16"/>
+                <w:szCs w:val="16"/>
+                <w:lang w:val="en-US"/>
+              </w:rPr>
+              <w:t>],</w:t>
+            </w:r>
+          </w:p>
+          <w:p>
+            <w:pPr>
+              <w:spacing w:after="0" w:line="240" w:lineRule="auto"/>
+              <w:rPr>
+                <w:rFonts w:ascii="Courier New" w:eastAsia="Times New Roman" w:hAnsi="Courier New" w:cs="Courier New"/>
+                <w:color w:val="000000"/>
+                <w:sz w:val="16"/>
+                <w:szCs w:val="16"/>
+                <w:lang w:val="en-US"/>
+              </w:rPr>
+            </w:pPr>
+            <w:r>
+              <w:rPr>
+                <w:rFonts w:ascii="Courier New" w:eastAsia="Times New Roman" w:hAnsi="Courier New" w:cs="Courier New"/>
+                <w:color w:val="000000"/>
+                <w:sz w:val="16"/>
+                <w:szCs w:val="16"/>
+                <w:lang w:val="en-US"/>
+              </w:rPr>
+              <w:t>"production": [</w:t>
+            </w:r>
+          </w:p>
+          <w:p>
+            <w:pPr>
+              <w:spacing w:after="0" w:line="240" w:lineRule="auto"/>
+              <w:rPr>
+                <w:rFonts w:ascii="Courier New" w:eastAsia="Times New Roman" w:hAnsi="Courier New" w:cs="Courier New"/>
+                <w:color w:val="000000"/>
+                <w:sz w:val="16"/>
+                <w:szCs w:val="16"/>
+                <w:lang w:val="en-US"/>
+              </w:rPr>
+            </w:pPr>
+            <w:r>
+              <w:rPr>
+                <w:rFonts w:ascii="Courier New" w:eastAsia="Times New Roman" w:hAnsi="Courier New" w:cs="Courier New"/>
+                <w:color w:val="000000"/>
+                <w:sz w:val="16"/>
+                <w:szCs w:val="16"/>
+                <w:lang w:val="en-US"/>
+              </w:rPr>
+              <w:lastRenderedPageBreak/>
+              <w:t xml:space="preserve">  </w:t>
+            </w:r>
+            <w:r>
+              <w:rPr>
+                <w:rFonts w:ascii="Courier New" w:eastAsia="Times New Roman" w:hAnsi="Courier New" w:cs="Courier New"/>
+                <w:color w:val="000000"/>
+                <w:sz w:val="16"/>
+                <w:szCs w:val="16"/>
+                <w:lang w:val="en-US"/>
+              </w:rPr>
+              <w:t>{</w:t>
+            </w:r>
+          </w:p>
+          <w:p>
+            <w:pPr>
+              <w:spacing w:after="0" w:line="240" w:lineRule="auto"/>
+              <w:rPr>
+                <w:rFonts w:ascii="Courier New" w:eastAsia="Times New Roman" w:hAnsi="Courier New" w:cs="Courier New"/>
+                <w:color w:val="000000"/>
+                <w:sz w:val="16"/>
+                <w:szCs w:val="16"/>
+                <w:lang w:val="en-US"/>
+              </w:rPr>
+            </w:pPr>
+            <w:r>
+              <w:rPr>
+                <w:rFonts w:ascii="Courier New" w:eastAsia="Times New Roman" w:hAnsi="Courier New" w:cs="Courier New"/>
+                <w:color w:val="000000"/>
+                <w:sz w:val="16"/>
+                <w:szCs w:val="16"/>
+                <w:lang w:val="en-US"/>
+              </w:rPr>
+              <w:t xml:space="preserve">   "time": string,</w:t>
+            </w:r>
+          </w:p>
+          <w:p>
+            <w:pPr>
+              <w:spacing w:after="0" w:line="240" w:lineRule="auto"/>
+              <w:rPr>
+                <w:rFonts w:ascii="Courier New" w:eastAsia="Times New Roman" w:hAnsi="Courier New" w:cs="Courier New"/>
+                <w:color w:val="000000"/>
+                <w:sz w:val="16"/>
+                <w:szCs w:val="16"/>
+                <w:lang w:val="en-US"/>
+              </w:rPr>
+            </w:pPr>
+            <w:r>
+              <w:rPr>
+                <w:rFonts w:ascii="Courier New" w:eastAsia="Times New Roman" w:hAnsi="Courier New" w:cs="Courier New"/>
+                <w:color w:val="000000"/>
+                <w:sz w:val="16"/>
+                <w:szCs w:val="16"/>
+                <w:lang w:val="en-US"/>
+              </w:rPr>
+              <w:t xml:space="preserve">   "value": float</w:t>
+            </w:r>
+          </w:p>
+          <w:p>
+            <w:pPr>
+              <w:spacing w:after="0" w:line="240" w:lineRule="auto"/>
+              <w:rPr>
+                <w:rFonts w:ascii="Courier New" w:eastAsia="Times New Roman" w:hAnsi="Courier New" w:cs="Courier New"/>
+                <w:color w:val="000000"/>
+                <w:sz w:val="16"/>
+                <w:szCs w:val="16"/>
+                <w:lang w:val="en-US"/>
+              </w:rPr>
+            </w:pPr>
+            <w:r>
+              <w:rPr>
+                <w:rFonts w:ascii="Courier New" w:eastAsia="Times New Roman" w:hAnsi="Courier New" w:cs="Courier New"/>
+                <w:color w:val="000000"/>
+                <w:sz w:val="16"/>
+                <w:szCs w:val="16"/>
+                <w:lang w:val="en-US"/>
+              </w:rPr>
+              <w:t xml:space="preserve">  },</w:t>
+            </w:r>
+          </w:p>
+          <w:p>
+            <w:pPr>
+              <w:spacing w:after="0" w:line="240" w:lineRule="auto"/>
+              <w:rPr>
+                <w:rFonts w:ascii="Courier New" w:eastAsia="Times New Roman" w:hAnsi="Courier New" w:cs="Courier New"/>
+                <w:color w:val="000000"/>
+                <w:sz w:val="16"/>
+                <w:szCs w:val="16"/>
+                <w:lang w:val="en-US"/>
+              </w:rPr>
+            </w:pPr>
+            <w:r>
+              <w:rPr>
+                <w:rFonts w:ascii="Courier New" w:eastAsia="Times New Roman" w:hAnsi="Courier New" w:cs="Courier New"/>
+                <w:color w:val="000000"/>
+                <w:sz w:val="16"/>
+                <w:szCs w:val="16"/>
+                <w:lang w:val="en-US"/>
+              </w:rPr>
+              <w:t xml:space="preserve"> …</w:t>
+            </w:r>
+          </w:p>
+          <w:p>
+            <w:pPr>
+              <w:spacing w:after="0" w:line="240" w:lineRule="auto"/>
+              <w:rPr>
+                <w:rFonts w:ascii="Courier New" w:eastAsia="Times New Roman" w:hAnsi="Courier New" w:cs="Courier New"/>
+                <w:color w:val="000000"/>
+                <w:sz w:val="16"/>
+                <w:szCs w:val="16"/>
+                <w:lang w:val="en-US"/>
+              </w:rPr>
+            </w:pPr>
+            <w:r>
+              <w:rPr>
+                <w:rFonts w:ascii="Courier New" w:eastAsia="Times New Roman" w:hAnsi="Courier New" w:cs="Courier New"/>
+                <w:color w:val="000000"/>
+                <w:sz w:val="16"/>
+                <w:szCs w:val="16"/>
+                <w:lang w:val="en-US"/>
+              </w:rPr>
+              <w:t>],</w:t>
+            </w:r>
+          </w:p>
+          <w:p>
+            <w:pPr>
+              <w:spacing w:after="0" w:line="240" w:lineRule="auto"/>
+              <w:rPr>
+                <w:rFonts w:ascii="Courier New" w:eastAsia="Times New Roman" w:hAnsi="Courier New" w:cs="Courier New"/>
+                <w:color w:val="000000"/>
+                <w:sz w:val="16"/>
+                <w:szCs w:val="16"/>
+                <w:lang w:val="en-US"/>
+              </w:rPr>
+            </w:pPr>
+            <w:r>
+              <w:rPr>
+                <w:rFonts w:ascii="Courier New" w:eastAsia="Times New Roman" w:hAnsi="Courier New" w:cs="Courier New"/>
+                <w:color w:val="000000"/>
+                <w:sz w:val="16"/>
+                <w:szCs w:val="16"/>
+                <w:lang w:val="en-US"/>
+              </w:rPr>
+              <w:t>"consumption": [</w:t>
+            </w:r>
+          </w:p>
+          <w:p>
+            <w:pPr>
+              <w:spacing w:after="0" w:line="240" w:lineRule="auto"/>
+              <w:rPr>
+                <w:rFonts w:ascii="Courier New" w:eastAsia="Times New Roman" w:hAnsi="Courier New" w:cs="Courier New"/>
+                <w:color w:val="000000"/>
+                <w:sz w:val="16"/>
+                <w:szCs w:val="16"/>
+                <w:lang w:val="en-US"/>
+              </w:rPr>
+            </w:pPr>
+            <w:r>
+              <w:rPr>
+                <w:rFonts w:ascii="Courier New" w:eastAsia="Times New Roman" w:hAnsi="Courier New" w:cs="Courier New"/>
+                <w:color w:val="000000"/>
+                <w:sz w:val="16"/>
+                <w:szCs w:val="16"/>
+                <w:lang w:val="en-US"/>
+              </w:rPr>
+              <w:t xml:space="preserve">  {</w:t>
+            </w:r>
+          </w:p>
+          <w:p>
+            <w:pPr>
+              <w:spacing w:after="0" w:line="240" w:lineRule="auto"/>
+              <w:rPr>
+                <w:rFonts w:ascii="Courier New" w:eastAsia="Times New Roman" w:hAnsi="Courier New" w:cs="Courier New"/>
+                <w:color w:val="000000"/>
+                <w:sz w:val="16"/>
+                <w:szCs w:val="16"/>
+                <w:lang w:val="en-US"/>
+              </w:rPr>
+            </w:pPr>
+            <w:r>
+              <w:rPr>
+                <w:rFonts w:ascii="Courier New" w:eastAsia="Times New Roman" w:hAnsi="Courier New" w:cs="Courier New"/>
+                <w:color w:val="000000"/>
+                <w:sz w:val="16"/>
+                <w:szCs w:val="16"/>
+                <w:lang w:val="en-US"/>
+              </w:rPr>
+              <w:t xml:space="preserve">   "time": string</w:t>
+            </w:r>
+          </w:p>
+          <w:p>
+            <w:pPr>
+              <w:spacing w:after="0" w:line="240" w:lineRule="auto"/>
+              <w:rPr>
+                <w:rFonts w:ascii="Courier New" w:eastAsia="Times New Roman" w:hAnsi="Courier New" w:cs="Courier New"/>
+                <w:color w:val="000000"/>
+                <w:sz w:val="16"/>
+                <w:szCs w:val="16"/>
+                <w:lang w:val="en-US"/>
+              </w:rPr>
+            </w:pPr>
+            <w:r>
+              <w:rPr>
+                <w:rFonts w:ascii="Courier New" w:eastAsia="Times New Roman" w:hAnsi="Courier New" w:cs="Courier New"/>
+                <w:color w:val="000000"/>
+                <w:sz w:val="16"/>
+                <w:szCs w:val="16"/>
+                <w:lang w:val="en-US"/>
+              </w:rPr>
+              <w:t xml:space="preserve">   "value": float</w:t>
+            </w:r>
+          </w:p>
+          <w:p>
+            <w:pPr>
+              <w:spacing w:after="0" w:line="240" w:lineRule="auto"/>
+              <w:rPr>
+                <w:rFonts w:ascii="Courier New" w:eastAsia="Times New Roman" w:hAnsi="Courier New" w:cs="Courier New"/>
+                <w:color w:val="000000"/>
+                <w:sz w:val="16"/>
+                <w:szCs w:val="16"/>
+                <w:lang w:val="en-US"/>
+              </w:rPr>
+            </w:pPr>
+            <w:r>
+              <w:rPr>
+                <w:rFonts w:ascii="Courier New" w:eastAsia="Times New Roman" w:hAnsi="Courier New" w:cs="Courier New"/>
+                <w:color w:val="000000"/>
+                <w:sz w:val="16"/>
+                <w:szCs w:val="16"/>
+                <w:lang w:val="en-US"/>
+              </w:rPr>
+              <w:t xml:space="preserve">  }</w:t>
+            </w:r>
+          </w:p>
+          <w:p>
+            <w:pPr>
+              <w:spacing w:after="0" w:line="240" w:lineRule="auto"/>
+              <w:rPr>
+                <w:rFonts w:ascii="Courier New" w:eastAsia="Times New Roman" w:hAnsi="Courier New" w:cs="Courier New"/>
+                <w:color w:val="000000"/>
+                <w:sz w:val="16"/>
+                <w:szCs w:val="16"/>
+                <w:lang w:val="en-US"/>
+              </w:rPr>
+            </w:pPr>
+            <w:r>
+              <w:rPr>
+                <w:rFonts w:ascii="Courier New" w:eastAsia="Times New Roman" w:hAnsi="Courier New" w:cs="Courier New"/>
+                <w:color w:val="000000"/>
+                <w:sz w:val="16"/>
+                <w:szCs w:val="16"/>
+                <w:lang w:val="en-US"/>
+              </w:rPr>
+              <w:t xml:space="preserve"> …</w:t>
+            </w:r>
+          </w:p>
+          <w:p>
+            <w:pPr>
+              <w:spacing w:after="0" w:line="240" w:lineRule="auto"/>
+              <w:rPr>
+                <w:rFonts w:ascii="Courier New" w:eastAsia="Times New Roman" w:hAnsi="Courier New" w:cs="Courier New"/>
+                <w:color w:val="000000"/>
+                <w:sz w:val="16"/>
+                <w:szCs w:val="16"/>
+                <w:lang w:val="en-US"/>
+              </w:rPr>
+            </w:pPr>
+            <w:r>
+              <w:rPr>
+                <w:rFonts w:ascii="Courier New" w:eastAsia="Times New Roman" w:hAnsi="Courier New" w:cs="Courier New"/>
+                <w:color w:val="000000"/>
+                <w:sz w:val="16"/>
+                <w:szCs w:val="16"/>
+                <w:lang w:val="en-US"/>
+              </w:rPr>
+              <w:t>,</w:t>
+            </w:r>
+          </w:p>
+          <w:p>
+            <w:pPr>
+              <w:spacing w:after="0" w:line="240" w:lineRule="auto"/>
+              <w:rPr>
+                <w:rFonts w:ascii="Courier New" w:eastAsia="Times New Roman" w:hAnsi="Courier New" w:cs="Courier New"/>
+                <w:color w:val="000000"/>
+                <w:sz w:val="16"/>
+                <w:szCs w:val="16"/>
+                <w:lang w:val="en-US"/>
+              </w:rPr>
+            </w:pPr>
+            <w:r>
+              <w:rPr>
+                <w:rFonts w:ascii="Courier New" w:eastAsia="Times New Roman" w:hAnsi="Courier New" w:cs="Courier New"/>
+                <w:color w:val="000000"/>
+                <w:sz w:val="16"/>
+                <w:szCs w:val="16"/>
+                <w:lang w:val="en-US"/>
+              </w:rPr>
+              <w:t>"</w:t>
+            </w:r>
+            <w:proofErr w:type="spellStart"/>
+            <w:proofErr w:type="gramStart"/>
+            <w:r>
+              <w:rPr>
+                <w:rFonts w:ascii="Courier New" w:eastAsia="Times New Roman" w:hAnsi="Courier New" w:cs="Courier New"/>
+                <w:color w:val="000000"/>
+                <w:sz w:val="16"/>
+                <w:szCs w:val="16"/>
+                <w:lang w:val="en-US"/>
+              </w:rPr>
+              <w:t>feed</w:t>
+            </w:r>
+            <w:proofErr w:type="gramEnd"/>
+            <w:r>
+              <w:rPr>
+                <w:rFonts w:ascii="Courier New" w:eastAsia="Times New Roman" w:hAnsi="Courier New" w:cs="Courier New"/>
+                <w:color w:val="000000"/>
+                <w:sz w:val="16"/>
+                <w:szCs w:val="16"/>
+                <w:lang w:val="en-US"/>
+              </w:rPr>
+              <w:t>_in</w:t>
+            </w:r>
+            <w:proofErr w:type="spellEnd"/>
+            <w:r>
+              <w:rPr>
+                <w:rFonts w:ascii="Courier New" w:eastAsia="Times New Roman" w:hAnsi="Courier New" w:cs="Courier New"/>
+                <w:color w:val="000000"/>
+                <w:sz w:val="16"/>
+                <w:szCs w:val="16"/>
+                <w:lang w:val="en-US"/>
+              </w:rPr>
+              <w:t>": [</w:t>
+            </w:r>
+          </w:p>
+          <w:p>
+            <w:pPr>
+              <w:spacing w:after="0" w:line="240" w:lineRule="auto"/>
+              <w:rPr>
+                <w:rFonts w:ascii="Courier New" w:eastAsia="Times New Roman" w:hAnsi="Courier New" w:cs="Courier New"/>
+                <w:color w:val="000000"/>
+                <w:sz w:val="16"/>
+                <w:szCs w:val="16"/>
+                <w:lang w:val="en-US"/>
+              </w:rPr>
+            </w:pPr>
+            <w:r>
+              <w:rPr>
+                <w:rFonts w:ascii="Courier New" w:eastAsia="Times New Roman" w:hAnsi="Courier New" w:cs="Courier New"/>
+                <w:color w:val="000000"/>
+                <w:sz w:val="16"/>
+                <w:szCs w:val="16"/>
+                <w:lang w:val="en-US"/>
+              </w:rPr>
+              <w:t xml:space="preserve"> {</w:t>
+            </w:r>
+          </w:p>
+          <w:p>
+            <w:pPr>
+              <w:spacing w:after="0" w:line="240" w:lineRule="auto"/>
+              <w:rPr>
+                <w:rFonts w:ascii="Courier New" w:eastAsia="Times New Roman" w:hAnsi="Courier New" w:cs="Courier New"/>
+                <w:color w:val="000000"/>
+                <w:sz w:val="16"/>
+                <w:szCs w:val="16"/>
+                <w:lang w:val="en-US"/>
+              </w:rPr>
+            </w:pPr>
+            <w:r>
+              <w:rPr>
+                <w:rFonts w:ascii="Courier New" w:eastAsia="Times New Roman" w:hAnsi="Courier New" w:cs="Courier New"/>
+                <w:color w:val="000000"/>
+                <w:sz w:val="16"/>
+                <w:szCs w:val="16"/>
+                <w:lang w:val="en-US"/>
+              </w:rPr>
+              <w:t xml:space="preserve">  "time": string,</w:t>
+            </w:r>
+          </w:p>
+          <w:p>
+            <w:pPr>
+              <w:spacing w:after="0" w:line="240" w:lineRule="auto"/>
+              <w:rPr>
+                <w:rFonts w:ascii="Courier New" w:eastAsia="Times New Roman" w:hAnsi="Courier New" w:cs="Courier New"/>
+                <w:color w:val="000000"/>
+                <w:sz w:val="16"/>
+                <w:szCs w:val="16"/>
+                <w:lang w:val="en-US"/>
+              </w:rPr>
+            </w:pPr>
+            <w:r>
+              <w:rPr>
+                <w:rFonts w:ascii="Courier New" w:eastAsia="Times New Roman" w:hAnsi="Courier New" w:cs="Courier New"/>
+                <w:color w:val="000000"/>
+                <w:sz w:val="16"/>
+                <w:szCs w:val="16"/>
+                <w:lang w:val="en-US"/>
+              </w:rPr>
+              <w:t xml:space="preserve">   "value": float</w:t>
+            </w:r>
+          </w:p>
+          <w:p>
+            <w:pPr>
+              <w:spacing w:after="0" w:line="240" w:lineRule="auto"/>
+              <w:rPr>
+                <w:rFonts w:ascii="Courier New" w:eastAsia="Times New Roman" w:hAnsi="Courier New" w:cs="Courier New"/>
+                <w:color w:val="000000"/>
+                <w:sz w:val="16"/>
+                <w:szCs w:val="16"/>
+                <w:lang w:val="en-US"/>
+              </w:rPr>
+            </w:pPr>
+            <w:r>
+              <w:rPr>
+                <w:rFonts w:ascii="Courier New" w:eastAsia="Times New Roman" w:hAnsi="Courier New" w:cs="Courier New"/>
+                <w:color w:val="000000"/>
+                <w:sz w:val="16"/>
+                <w:szCs w:val="16"/>
+                <w:lang w:val="en-US"/>
+              </w:rPr>
+              <w:t xml:space="preserve"> },</w:t>
+            </w:r>
+          </w:p>
+          <w:p>
+            <w:pPr>
+              <w:spacing w:after="0" w:line="240" w:lineRule="auto"/>
+              <w:rPr>
+                <w:rFonts w:ascii="Courier New" w:eastAsia="Times New Roman" w:hAnsi="Courier New" w:cs="Courier New"/>
+                <w:color w:val="000000"/>
+                <w:sz w:val="16"/>
+                <w:szCs w:val="16"/>
+                <w:lang w:val="en-US"/>
+              </w:rPr>
+            </w:pPr>
+            <w:r>
+              <w:rPr>
+                <w:rFonts w:ascii="Courier New" w:eastAsia="Times New Roman" w:hAnsi="Courier New" w:cs="Courier New"/>
+                <w:color w:val="000000"/>
+                <w:sz w:val="16"/>
+                <w:szCs w:val="16"/>
+                <w:lang w:val="en-US"/>
+              </w:rPr>
+              <w:t xml:space="preserve"> …</w:t>
+            </w:r>
+          </w:p>
+          <w:p>
+            <w:pPr>
+              <w:spacing w:after="0" w:line="240" w:lineRule="auto"/>
+              <w:rPr>
+                <w:rFonts w:ascii="Courier New" w:eastAsia="Times New Roman" w:hAnsi="Courier New" w:cs="Courier New"/>
+                <w:color w:val="000000"/>
+                <w:sz w:val="16"/>
+                <w:szCs w:val="16"/>
+                <w:lang w:val="en-US"/>
+              </w:rPr>
+            </w:pPr>
+            <w:r>
+              <w:rPr>
+                <w:rFonts w:ascii="Courier New" w:eastAsia="Times New Roman" w:hAnsi="Courier New" w:cs="Courier New"/>
+                <w:color w:val="000000"/>
+                <w:sz w:val="16"/>
+                <w:szCs w:val="16"/>
+                <w:lang w:val="en-US"/>
+              </w:rPr>
+              <w:t>],</w:t>
+            </w:r>
+          </w:p>
+          <w:p>
+            <w:pPr>
+              <w:spacing w:after="0" w:line="240" w:lineRule="auto"/>
+              <w:rPr>
+                <w:rFonts w:ascii="Courier New" w:eastAsia="Times New Roman" w:hAnsi="Courier New" w:cs="Courier New"/>
+                <w:color w:val="000000"/>
+                <w:sz w:val="16"/>
+                <w:szCs w:val="16"/>
+                <w:lang w:val="en-US"/>
+              </w:rPr>
+            </w:pPr>
+            <w:r>
+              <w:rPr>
+                <w:rFonts w:ascii="Courier New" w:eastAsia="Times New Roman" w:hAnsi="Courier New" w:cs="Courier New"/>
+                <w:color w:val="000000"/>
+                <w:sz w:val="16"/>
+                <w:szCs w:val="16"/>
+                <w:lang w:val="en-US"/>
+              </w:rPr>
+              <w:t>"</w:t>
+            </w:r>
+            <w:proofErr w:type="spellStart"/>
+            <w:proofErr w:type="gramStart"/>
+            <w:r>
+              <w:rPr>
+                <w:rFonts w:ascii="Courier New" w:eastAsia="Times New Roman" w:hAnsi="Courier New" w:cs="Courier New"/>
+                <w:color w:val="000000"/>
+                <w:sz w:val="16"/>
+                <w:szCs w:val="16"/>
+                <w:lang w:val="en-US"/>
+              </w:rPr>
               <w:t>from</w:t>
             </w:r>
             <w:proofErr w:type="gramEnd"/>
@@ -5430,50 +5659,6 @@
                 <w:lang w:val="en-US"/>
               </w:rPr>
               <w:t>]</w:t>
-            </w:r>
-            <w:r>
-              <w:rPr>
-                <w:rFonts w:ascii="Courier New" w:eastAsia="Times New Roman" w:hAnsi="Courier New" w:cs="Courier New"/>
-                <w:color w:val="000000"/>
-                <w:sz w:val="16"/>
-                <w:szCs w:val="16"/>
-                <w:lang w:val="en-US"/>
-              </w:rPr>
-              <w:t>,</w:t>
-            </w:r>
-          </w:p>
-          <w:p>
-            <w:pPr>
-              <w:spacing w:after="0" w:line="240" w:lineRule="auto"/>
-              <w:rPr>
-                <w:rFonts w:ascii="Courier New" w:eastAsia="Times New Roman" w:hAnsi="Courier New" w:cs="Courier New"/>
-                <w:color w:val="000000"/>
-                <w:sz w:val="16"/>
-                <w:szCs w:val="16"/>
-                <w:lang w:val="en-US"/>
-              </w:rPr>
-            </w:pPr>
-            <w:proofErr w:type="spellStart"/>
-            <w:r>
-              <w:rPr>
-                <w:rFonts w:ascii="Courier New" w:eastAsia="Times New Roman" w:hAnsi="Courier New" w:cs="Courier New"/>
-                <w:color w:val="000000"/>
-                <w:sz w:val="16"/>
-                <w:szCs w:val="16"/>
-                <w:lang w:val="en-US"/>
-              </w:rPr>
-              <w:t>time_execution_limit_secs</w:t>
-            </w:r>
-            <w:proofErr w:type="spellEnd"/>
-            <w:r>
-              <w:rPr>
-                <w:rFonts w:ascii="Courier New" w:eastAsia="Times New Roman" w:hAnsi="Courier New" w:cs="Courier New"/>
-                <w:color w:val="000000"/>
-                <w:sz w:val="16"/>
-                <w:szCs w:val="16"/>
-                <w:lang w:val="en-US"/>
-              </w:rPr>
-              <w:t>": integer</w:t>
             </w:r>
           </w:p>
           <w:p>
@@ -5581,58 +5766,6 @@
               </w:rPr>
               <w:t>"</w:t>
             </w:r>
-            <w:r>
-              <w:rPr>
-                <w:rFonts w:ascii="Courier New" w:eastAsia="Times New Roman" w:hAnsi="Courier New" w:cs="Courier New"/>
-                <w:color w:val="000000"/>
-                <w:sz w:val="16"/>
-                <w:szCs w:val="16"/>
-                <w:lang w:val="en-US"/>
-              </w:rPr>
-              <w:t>time</w:t>
-            </w:r>
-            <w:r>
-              <w:rPr>
-                <w:rFonts w:ascii="Courier New" w:eastAsia="Times New Roman" w:hAnsi="Courier New" w:cs="Courier New"/>
-                <w:color w:val="000000"/>
-                <w:sz w:val="16"/>
-                <w:szCs w:val="16"/>
-                <w:lang w:val="en-US"/>
-              </w:rPr>
-              <w:t>"</w:t>
-            </w:r>
-            <w:r>
-              <w:rPr>
-                <w:rFonts w:ascii="Courier New" w:eastAsia="Times New Roman" w:hAnsi="Courier New" w:cs="Courier New"/>
-                <w:color w:val="000000"/>
-                <w:sz w:val="16"/>
-                <w:szCs w:val="16"/>
-                <w:lang w:val="en-US"/>
-              </w:rPr>
-              <w:t>: string,</w:t>
-            </w:r>
-          </w:p>
-          <w:p>
-            <w:pPr>
-              <w:spacing w:after="0" w:line="240" w:lineRule="auto"/>
-              <w:rPr>
-                <w:rFonts w:ascii="Courier New" w:eastAsia="Times New Roman" w:hAnsi="Courier New" w:cs="Courier New"/>
-                <w:color w:val="000000"/>
-                <w:sz w:val="16"/>
-                <w:szCs w:val="16"/>
-                <w:lang w:val="en-US"/>
-              </w:rPr>
-            </w:pPr>
-            <w:r>
-              <w:rPr>
-                <w:rFonts w:ascii="Courier New" w:eastAsia="Times New Roman" w:hAnsi="Courier New" w:cs="Courier New"/>
-                <w:color w:val="000000"/>
-                <w:sz w:val="16"/>
-                <w:szCs w:val="16"/>
-                <w:lang w:val="en-US"/>
-              </w:rPr>
-              <w:t>"</w:t>
-            </w:r>
             <w:proofErr w:type="spellStart"/>
             <w:proofErr w:type="gramStart"/>
             <w:r>
@@ -5718,7 +5851,7 @@
         <w:rPr>
           <w:rFonts w:ascii="Times New Roman" w:eastAsia="Times New Roman" w:hAnsi="Times New Roman" w:cs="Times New Roman"/>
           <w:kern w:val="0"/>
-          <w:lang w:eastAsia="it-IT"/>
+          <w:lang w:val="en-US" w:eastAsia="it-IT"/>
           <w14:ligatures w14:val="none"/>
         </w:rPr>
       </w:pPr>
@@ -5887,6 +6020,7 @@
           <w14:ligatures w14:val="none"/>
         </w:rPr>
       </w:pPr>
+      <w:proofErr w:type="spellStart"/>
       <w:r>
         <w:rPr>
           <w:rFonts w:ascii="Times New Roman" w:eastAsia="Times New Roman" w:hAnsi="Times New Roman" w:cs="Times New Roman"/>
@@ -5896,25 +6030,57 @@
           <w:lang w:eastAsia="it-IT"/>
           <w14:ligatures w14:val="none"/>
         </w:rPr>
-        <w:t>time</w:t>
-      </w:r>
-      <w:r>
-        <w:rPr>
-          <w:rFonts w:ascii="Times New Roman" w:eastAsia="Times New Roman" w:hAnsi="Times New Roman" w:cs="Times New Roman"/>
-          <w:kern w:val="0"/>
-          <w:lang w:eastAsia="it-IT"/>
-          <w14:ligatures w14:val="none"/>
-        </w:rPr>
-        <w:t>:</w:t>
-      </w:r>
-      <w:r>
-        <w:rPr>
-          <w:rFonts w:ascii="Times New Roman" w:eastAsia="Times New Roman" w:hAnsi="Times New Roman" w:cs="Times New Roman"/>
-          <w:kern w:val="0"/>
-          <w:lang w:eastAsia="it-IT"/>
-          <w14:ligatures w14:val="none"/>
-        </w:rPr>
-        <w:t xml:space="preserve"> indica l’orario per il quale si intende ricevere la raccomandazione. Se non specificato, viene considerata l’ora corrente</w:t>
+        <w:t>init_charge_percentage</w:t>
+      </w:r>
+      <w:proofErr w:type="spellEnd"/>
+      <w:r>
+        <w:rPr>
+          <w:rFonts w:ascii="Times New Roman" w:eastAsia="Times New Roman" w:hAnsi="Times New Roman" w:cs="Times New Roman"/>
+          <w:kern w:val="0"/>
+          <w:lang w:eastAsia="it-IT"/>
+          <w14:ligatures w14:val="none"/>
+        </w:rPr>
+        <w:t xml:space="preserve">: valore </w:t>
+      </w:r>
+      <w:r>
+        <w:rPr>
+          <w:rFonts w:ascii="Times New Roman" w:eastAsia="Times New Roman" w:hAnsi="Times New Roman" w:cs="Times New Roman"/>
+          <w:i/>
+          <w:iCs/>
+          <w:kern w:val="0"/>
+          <w:lang w:eastAsia="it-IT"/>
+          <w14:ligatures w14:val="none"/>
+        </w:rPr>
+        <w:t>opzionale</w:t>
+      </w:r>
+      <w:r>
+        <w:rPr>
+          <w:rFonts w:ascii="Times New Roman" w:eastAsia="Times New Roman" w:hAnsi="Times New Roman" w:cs="Times New Roman"/>
+          <w:kern w:val="0"/>
+          <w:lang w:eastAsia="it-IT"/>
+          <w14:ligatures w14:val="none"/>
+        </w:rPr>
+        <w:t xml:space="preserve"> che indica la percentuale iniziale di carica del sistema di accumulo. Viene specificato nel caso in cui sia stata fatta un’invocazione precedente che ha determinato lo stato di carica della batteria oppure nel caso si voglia supporre che la carica sia quella passata in input. Qualora </w:t>
+      </w:r>
+      <w:proofErr w:type="gramStart"/>
+      <w:r>
+        <w:rPr>
+          <w:rFonts w:ascii="Times New Roman" w:eastAsia="Times New Roman" w:hAnsi="Times New Roman" w:cs="Times New Roman"/>
+          <w:kern w:val="0"/>
+          <w:lang w:eastAsia="it-IT"/>
+          <w14:ligatures w14:val="none"/>
+        </w:rPr>
+        <w:t>non viene specificata</w:t>
+      </w:r>
+      <w:proofErr w:type="gramEnd"/>
+      <w:r>
+        <w:rPr>
+          <w:rFonts w:ascii="Times New Roman" w:eastAsia="Times New Roman" w:hAnsi="Times New Roman" w:cs="Times New Roman"/>
+          <w:kern w:val="0"/>
+          <w:lang w:eastAsia="it-IT"/>
+          <w14:ligatures w14:val="none"/>
+        </w:rPr>
+        <w:t>, come percentuale di carica viene considerata quella reale allo stato attuale oppure 0 quando non determinabile.</w:t>
       </w:r>
     </w:p>
     <w:p>
@@ -5942,7 +6108,7 @@
           <w:lang w:eastAsia="it-IT"/>
           <w14:ligatures w14:val="none"/>
         </w:rPr>
-        <w:t>init_charge_percentage</w:t>
+        <w:t>production_current</w:t>
       </w:r>
       <w:proofErr w:type="spellEnd"/>
       <w:r>
@@ -5952,8 +6118,25 @@
           <w:lang w:eastAsia="it-IT"/>
           <w14:ligatures w14:val="none"/>
         </w:rPr>
-        <w:t xml:space="preserve">: valore </w:t>
-      </w:r>
+        <w:t>: indica il valore della produzione conosciuto da considerare per la raccomandazione.</w:t>
+      </w:r>
+    </w:p>
+    <w:p>
+      <w:pPr>
+        <w:numPr>
+          <w:ilvl w:val="0"/>
+          <w:numId w:val="3"/>
+        </w:numPr>
+        <w:spacing w:before="100" w:beforeAutospacing="1" w:after="100" w:afterAutospacing="1" w:line="240" w:lineRule="auto"/>
+        <w:jc w:val="both"/>
+        <w:rPr>
+          <w:rFonts w:ascii="Times New Roman" w:eastAsia="Times New Roman" w:hAnsi="Times New Roman" w:cs="Times New Roman"/>
+          <w:kern w:val="0"/>
+          <w:lang w:eastAsia="it-IT"/>
+          <w14:ligatures w14:val="none"/>
+        </w:rPr>
+      </w:pPr>
+      <w:proofErr w:type="spellStart"/>
       <w:r>
         <w:rPr>
           <w:rFonts w:ascii="Times New Roman" w:eastAsia="Times New Roman" w:hAnsi="Times New Roman" w:cs="Times New Roman"/>
@@ -5963,36 +6146,53 @@
           <w:lang w:eastAsia="it-IT"/>
           <w14:ligatures w14:val="none"/>
         </w:rPr>
-        <w:t>opzionale</w:t>
-      </w:r>
-      <w:r>
-        <w:rPr>
-          <w:rFonts w:ascii="Times New Roman" w:eastAsia="Times New Roman" w:hAnsi="Times New Roman" w:cs="Times New Roman"/>
-          <w:kern w:val="0"/>
-          <w:lang w:eastAsia="it-IT"/>
-          <w14:ligatures w14:val="none"/>
-        </w:rPr>
-        <w:t xml:space="preserve"> che indica la percentuale iniziale di carica del sistema di accumulo. Viene specificato nel caso in cui sia stata fatta un’invocazione precedente che ha determinato lo stato di carica della batteria oppure nel caso si voglia supporre che la carica sia quella passata in input. Qualora </w:t>
-      </w:r>
-      <w:proofErr w:type="gramStart"/>
-      <w:r>
-        <w:rPr>
-          <w:rFonts w:ascii="Times New Roman" w:eastAsia="Times New Roman" w:hAnsi="Times New Roman" w:cs="Times New Roman"/>
-          <w:kern w:val="0"/>
-          <w:lang w:eastAsia="it-IT"/>
-          <w14:ligatures w14:val="none"/>
-        </w:rPr>
-        <w:t>non viene specificata</w:t>
-      </w:r>
-      <w:proofErr w:type="gramEnd"/>
-      <w:r>
-        <w:rPr>
-          <w:rFonts w:ascii="Times New Roman" w:eastAsia="Times New Roman" w:hAnsi="Times New Roman" w:cs="Times New Roman"/>
-          <w:kern w:val="0"/>
-          <w:lang w:eastAsia="it-IT"/>
-          <w14:ligatures w14:val="none"/>
-        </w:rPr>
-        <w:t>, come percentuale di carica viene considerata quella reale allo stato attuale oppure 0 quando non determinabile.</w:t>
+        <w:t>consumption_current</w:t>
+      </w:r>
+      <w:proofErr w:type="spellEnd"/>
+      <w:r>
+        <w:rPr>
+          <w:rFonts w:ascii="Times New Roman" w:eastAsia="Times New Roman" w:hAnsi="Times New Roman" w:cs="Times New Roman"/>
+          <w:kern w:val="0"/>
+          <w:lang w:eastAsia="it-IT"/>
+          <w14:ligatures w14:val="none"/>
+        </w:rPr>
+        <w:t>:</w:t>
+      </w:r>
+      <w:r>
+        <w:rPr>
+          <w:rFonts w:ascii="Times New Roman" w:eastAsia="Times New Roman" w:hAnsi="Times New Roman" w:cs="Times New Roman"/>
+          <w:kern w:val="0"/>
+          <w:lang w:eastAsia="it-IT"/>
+          <w14:ligatures w14:val="none"/>
+        </w:rPr>
+        <w:t xml:space="preserve"> </w:t>
+      </w:r>
+      <w:r>
+        <w:rPr>
+          <w:rFonts w:ascii="Times New Roman" w:eastAsia="Times New Roman" w:hAnsi="Times New Roman" w:cs="Times New Roman"/>
+          <w:kern w:val="0"/>
+          <w:lang w:eastAsia="it-IT"/>
+          <w14:ligatures w14:val="none"/>
+        </w:rPr>
+        <w:t>indica il valore d</w:t>
+      </w:r>
+      <w:r>
+        <w:rPr>
+          <w:rFonts w:ascii="Times New Roman" w:eastAsia="Times New Roman" w:hAnsi="Times New Roman" w:cs="Times New Roman"/>
+          <w:kern w:val="0"/>
+          <w:lang w:eastAsia="it-IT"/>
+          <w14:ligatures w14:val="none"/>
+        </w:rPr>
+        <w:t xml:space="preserve">i consumo </w:t>
+      </w:r>
+      <w:r>
+        <w:rPr>
+          <w:rFonts w:ascii="Times New Roman" w:eastAsia="Times New Roman" w:hAnsi="Times New Roman" w:cs="Times New Roman"/>
+          <w:kern w:val="0"/>
+          <w:lang w:eastAsia="it-IT"/>
+          <w14:ligatures w14:val="none"/>
+        </w:rPr>
+        <w:t>conosciuto da considerare per la raccomandazione.</w:t>
       </w:r>
     </w:p>
     <w:p>
@@ -6411,16 +6611,7 @@
           <w:lang w:eastAsia="it-IT"/>
           <w14:ligatures w14:val="none"/>
         </w:rPr>
-        <w:t xml:space="preserve"> che indica la quantità prodotta di energia </w:t>
-      </w:r>
-      <w:r>
-        <w:rPr>
-          <w:rFonts w:ascii="Times New Roman" w:eastAsia="Times New Roman" w:hAnsi="Times New Roman" w:cs="Times New Roman"/>
-          <w:kern w:val="0"/>
-          <w:lang w:eastAsia="it-IT"/>
-          <w14:ligatures w14:val="none"/>
-        </w:rPr>
-        <w:t xml:space="preserve">negli orari precedenti a quelli indicati da </w:t>
+        <w:t xml:space="preserve"> che indica la quantità prodotta di energia negli orari precedenti a quelli indicati da </w:t>
       </w:r>
       <w:r>
         <w:rPr>
@@ -6488,6 +6679,7 @@
           <w:lang w:eastAsia="it-IT"/>
           <w14:ligatures w14:val="none"/>
         </w:rPr>
+        <w:lastRenderedPageBreak/>
         <w:t>consumption</w:t>
       </w:r>
       <w:proofErr w:type="spellEnd"/>
@@ -6507,16 +6699,7 @@
           <w:lang w:eastAsia="it-IT"/>
           <w14:ligatures w14:val="none"/>
         </w:rPr>
-        <w:t xml:space="preserve">che indica </w:t>
-      </w:r>
-      <w:r>
-        <w:rPr>
-          <w:rFonts w:ascii="Times New Roman" w:eastAsia="Times New Roman" w:hAnsi="Times New Roman" w:cs="Times New Roman"/>
-          <w:kern w:val="0"/>
-          <w:lang w:eastAsia="it-IT"/>
-          <w14:ligatures w14:val="none"/>
-        </w:rPr>
-        <w:t xml:space="preserve">la quantità prodotta di energia negli orari precedenti a quelli indicati da </w:t>
+        <w:t xml:space="preserve">che indica la quantità prodotta di energia negli orari precedenti a quelli indicati da </w:t>
       </w:r>
       <w:r>
         <w:rPr>
@@ -6632,16 +6815,7 @@
           <w:lang w:eastAsia="it-IT"/>
           <w14:ligatures w14:val="none"/>
         </w:rPr>
-        <w:t xml:space="preserve">immessa rete </w:t>
-      </w:r>
-      <w:r>
-        <w:rPr>
-          <w:rFonts w:ascii="Times New Roman" w:eastAsia="Times New Roman" w:hAnsi="Times New Roman" w:cs="Times New Roman"/>
-          <w:kern w:val="0"/>
-          <w:lang w:eastAsia="it-IT"/>
-          <w14:ligatures w14:val="none"/>
-        </w:rPr>
-        <w:t xml:space="preserve">negli orari precedenti a quelli indicati da </w:t>
+        <w:t xml:space="preserve">immessa rete negli orari precedenti a quelli indicati da </w:t>
       </w:r>
       <w:r>
         <w:rPr>
@@ -6689,7 +6863,6 @@
           <w:lang w:eastAsia="it-IT"/>
           <w14:ligatures w14:val="none"/>
         </w:rPr>
-        <w:lastRenderedPageBreak/>
         <w:t>from_grid</w:t>
       </w:r>
       <w:proofErr w:type="spellEnd"/>
@@ -6720,16 +6893,7 @@
           <w:lang w:eastAsia="it-IT"/>
           <w14:ligatures w14:val="none"/>
         </w:rPr>
-        <w:t xml:space="preserve"> dalla rete</w:t>
-      </w:r>
-      <w:r>
-        <w:rPr>
-          <w:rFonts w:ascii="Times New Roman" w:eastAsia="Times New Roman" w:hAnsi="Times New Roman" w:cs="Times New Roman"/>
-          <w:kern w:val="0"/>
-          <w:lang w:eastAsia="it-IT"/>
-          <w14:ligatures w14:val="none"/>
-        </w:rPr>
-        <w:t xml:space="preserve"> negli orari precedenti a quelli indicati da </w:t>
+        <w:t xml:space="preserve"> dalla rete negli orari precedenti a quelli indicati da </w:t>
       </w:r>
       <w:r>
         <w:rPr>
@@ -6750,62 +6914,6 @@
           <w14:ligatures w14:val="none"/>
         </w:rPr>
         <w:t>.</w:t>
-      </w:r>
-    </w:p>
-    <w:p>
-      <w:pPr>
-        <w:pStyle w:val="Paragrafoelenco"/>
-        <w:numPr>
-          <w:ilvl w:val="0"/>
-          <w:numId w:val="3"/>
-        </w:numPr>
-        <w:jc w:val="both"/>
-        <w:rPr>
-          <w:rFonts w:ascii="Times New Roman" w:eastAsia="Times New Roman" w:hAnsi="Times New Roman" w:cs="Times New Roman"/>
-          <w:kern w:val="0"/>
-          <w:lang w:eastAsia="it-IT"/>
-          <w14:ligatures w14:val="none"/>
-        </w:rPr>
-      </w:pPr>
-      <w:proofErr w:type="spellStart"/>
-      <w:r>
-        <w:rPr>
-          <w:rFonts w:ascii="Times New Roman" w:eastAsia="Times New Roman" w:hAnsi="Times New Roman" w:cs="Times New Roman"/>
-          <w:i/>
-          <w:iCs/>
-          <w:kern w:val="0"/>
-          <w:lang w:eastAsia="it-IT"/>
-          <w14:ligatures w14:val="none"/>
-        </w:rPr>
-        <w:t>time_execution_limit_secs</w:t>
-      </w:r>
-      <w:proofErr w:type="spellEnd"/>
-      <w:r>
-        <w:rPr>
-          <w:rFonts w:ascii="Times New Roman" w:eastAsia="Times New Roman" w:hAnsi="Times New Roman" w:cs="Times New Roman"/>
-          <w:kern w:val="0"/>
-          <w:lang w:eastAsia="it-IT"/>
-          <w14:ligatures w14:val="none"/>
-        </w:rPr>
-        <w:t>: l’algoritmo funziona in modo tale che appena trova una soluzione ottima la restituisce immediatamente. Qualora non riesc</w:t>
-      </w:r>
-      <w:r>
-        <w:rPr>
-          <w:rFonts w:ascii="Times New Roman" w:eastAsia="Times New Roman" w:hAnsi="Times New Roman" w:cs="Times New Roman"/>
-          <w:kern w:val="0"/>
-          <w:lang w:eastAsia="it-IT"/>
-          <w14:ligatures w14:val="none"/>
-        </w:rPr>
-        <w:t>a</w:t>
-      </w:r>
-      <w:r>
-        <w:rPr>
-          <w:rFonts w:ascii="Times New Roman" w:eastAsia="Times New Roman" w:hAnsi="Times New Roman" w:cs="Times New Roman"/>
-          <w:kern w:val="0"/>
-          <w:lang w:eastAsia="it-IT"/>
-          <w14:ligatures w14:val="none"/>
-        </w:rPr>
-        <w:t xml:space="preserve"> a trovare una soluzione ottima in un tempo prestabilito, viene restituita una soluzione sub-ottima qualora sia stata determinata in quel tempo. Se nell’invocazione viene specificato questo parametro, dopo quel numero di secondi massimi viene comunque restituita una soluzione se determinata. Se questo parametro non viene specificato, il tempo limite di default è 20 minuti.</w:t>
       </w:r>
     </w:p>
     <w:p>
@@ -6899,51 +7007,6 @@
           <w14:ligatures w14:val="none"/>
         </w:rPr>
         <w:t xml:space="preserve"> preso in considerazione nel calcolo della soluzione.</w:t>
-      </w:r>
-    </w:p>
-    <w:p>
-      <w:pPr>
-        <w:numPr>
-          <w:ilvl w:val="0"/>
-          <w:numId w:val="4"/>
-        </w:numPr>
-        <w:spacing w:before="100" w:beforeAutospacing="1" w:after="100" w:afterAutospacing="1" w:line="240" w:lineRule="auto"/>
-        <w:jc w:val="both"/>
-        <w:rPr>
-          <w:rFonts w:ascii="Times New Roman" w:eastAsia="Times New Roman" w:hAnsi="Times New Roman" w:cs="Times New Roman"/>
-          <w:kern w:val="0"/>
-          <w:lang w:eastAsia="it-IT"/>
-          <w14:ligatures w14:val="none"/>
-        </w:rPr>
-      </w:pPr>
-      <w:r>
-        <w:rPr>
-          <w:rFonts w:ascii="Times New Roman" w:eastAsia="Times New Roman" w:hAnsi="Times New Roman" w:cs="Times New Roman"/>
-          <w:i/>
-          <w:iCs/>
-          <w:kern w:val="0"/>
-          <w:lang w:eastAsia="it-IT"/>
-          <w14:ligatures w14:val="none"/>
-        </w:rPr>
-        <w:t>time</w:t>
-      </w:r>
-      <w:r>
-        <w:rPr>
-          <w:rFonts w:ascii="Times New Roman" w:eastAsia="Times New Roman" w:hAnsi="Times New Roman" w:cs="Times New Roman"/>
-          <w:kern w:val="0"/>
-          <w:lang w:eastAsia="it-IT"/>
-          <w14:ligatures w14:val="none"/>
-        </w:rPr>
-        <w:t>:</w:t>
-      </w:r>
-      <w:r>
-        <w:rPr>
-          <w:rFonts w:ascii="Times New Roman" w:eastAsia="Times New Roman" w:hAnsi="Times New Roman" w:cs="Times New Roman"/>
-          <w:kern w:val="0"/>
-          <w:lang w:eastAsia="it-IT"/>
-          <w14:ligatures w14:val="none"/>
-        </w:rPr>
-        <w:t xml:space="preserve"> indica l’orario in cui effettuare la raccomandazione. Questo è lo stesso valore dato in input.</w:t>
       </w:r>
     </w:p>
     <w:p>

</xml_diff>